<commit_message>
CF-YOLO & PYNQ-Z2 PS baseline
27/7/2026 22:14
</commit_message>
<xml_diff>
--- a/z reports/CHY report w9 - prun, pynq.docx
+++ b/z reports/CHY report w9 - prun, pynq.docx
@@ -105,13 +105,107 @@
         <w:rPr>
           <w:rFonts w:eastAsiaTheme="majorEastAsia" w:cs="Times New Roman"/>
         </w:rPr>
-        <w:t>XWOD: A Real-World Benchmark for Object Detection under Extreme Weather Conditions was released as an arXiv preprint in May 2026. It introduces a real-image traffic-object detection dataset and evaluates YOLOv8, YOLO11, and YOLO26 at the nano, small, medium, large, and extra-large scales.</w:t>
+        <w:t xml:space="preserve">XWOD: A Real-World Benchmark for Object Detection under Extreme Weather Conditions was released as an </w:t>
+      </w:r>
+      <w:proofErr w:type="spellStart"/>
+      <w:r>
+        <w:rPr>
+          <w:rFonts w:eastAsiaTheme="majorEastAsia" w:cs="Times New Roman"/>
+        </w:rPr>
+        <w:t>arXiv</w:t>
+      </w:r>
+      <w:proofErr w:type="spellEnd"/>
+      <w:r>
+        <w:rPr>
+          <w:rFonts w:eastAsiaTheme="majorEastAsia" w:cs="Times New Roman"/>
+        </w:rPr>
+        <w:t xml:space="preserve"> preprint in May 2026. It introduces a real-image traffic-object detection dataset and evaluates YOLOv8, YOLO11, and YOLO26 at the nano, small, medium, large, and extra-large scales.</w:t>
       </w:r>
       <w:r>
         <w:rPr>
           <w:rFonts w:eastAsiaTheme="majorEastAsia" w:cs="Times New Roman"/>
         </w:rPr>
         <w:t xml:space="preserve"> [2]</w:t>
+      </w:r>
+    </w:p>
+    <w:p>
+      <w:pPr>
+        <w:rPr>
+          <w:rFonts w:eastAsiaTheme="majorEastAsia" w:cs="Times New Roman"/>
+        </w:rPr>
+      </w:pPr>
+    </w:p>
+    <w:p>
+      <w:pPr>
+        <w:rPr>
+          <w:rFonts w:eastAsiaTheme="majorEastAsia" w:cs="Times New Roman"/>
+        </w:rPr>
+      </w:pPr>
+      <w:r>
+        <w:rPr>
+          <w:rFonts w:eastAsiaTheme="majorEastAsia" w:cs="Times New Roman"/>
+        </w:rPr>
+        <w:t xml:space="preserve">At the time of this report, XWOD is available only as an </w:t>
+      </w:r>
+      <w:proofErr w:type="spellStart"/>
+      <w:r>
+        <w:rPr>
+          <w:rFonts w:eastAsiaTheme="majorEastAsia" w:cs="Times New Roman"/>
+        </w:rPr>
+        <w:t>arXiv</w:t>
+      </w:r>
+      <w:proofErr w:type="spellEnd"/>
+      <w:r>
+        <w:rPr>
+          <w:rFonts w:eastAsiaTheme="majorEastAsia" w:cs="Times New Roman"/>
+        </w:rPr>
+        <w:t xml:space="preserve"> preprint. Therefore, it is used as a recent preliminary benchmark in this report, while a peer-reviewed competitor will be selected for the next report.</w:t>
+      </w:r>
+    </w:p>
+    <w:p>
+      <w:pPr>
+        <w:rPr>
+          <w:rFonts w:eastAsiaTheme="majorEastAsia" w:cs="Times New Roman"/>
+        </w:rPr>
+      </w:pPr>
+    </w:p>
+    <w:p>
+      <w:pPr>
+        <w:rPr>
+          <w:rFonts w:eastAsiaTheme="majorEastAsia" w:cs="Times New Roman"/>
+        </w:rPr>
+      </w:pPr>
+      <w:r>
+        <w:rPr>
+          <w:rFonts w:eastAsiaTheme="majorEastAsia" w:cs="Times New Roman"/>
+        </w:rPr>
+        <w:t xml:space="preserve">The main contribution of XWOD </w:t>
+      </w:r>
+      <w:proofErr w:type="gramStart"/>
+      <w:r>
+        <w:rPr>
+          <w:rFonts w:eastAsiaTheme="majorEastAsia" w:cs="Times New Roman"/>
+        </w:rPr>
+        <w:t>is</w:t>
+      </w:r>
+      <w:proofErr w:type="gramEnd"/>
+      <w:r>
+        <w:rPr>
+          <w:rFonts w:eastAsiaTheme="majorEastAsia" w:cs="Times New Roman"/>
+        </w:rPr>
+        <w:t xml:space="preserve"> </w:t>
+      </w:r>
+      <w:r>
+        <w:rPr>
+          <w:rFonts w:eastAsiaTheme="majorEastAsia" w:cs="Times New Roman"/>
+        </w:rPr>
+        <w:t>i</w:t>
+      </w:r>
+      <w:r>
+        <w:rPr>
+          <w:rFonts w:eastAsiaTheme="majorEastAsia" w:cs="Times New Roman"/>
+        </w:rPr>
+        <w:t>t introduces a large real-image traffic dataset covering seven extreme-weather conditions, together with standard detection, weather-generalization, and cross-dataset evaluation protocols.</w:t>
       </w:r>
     </w:p>
     <w:p>
@@ -218,6 +312,19 @@
       <w:pPr>
         <w:rPr>
           <w:rFonts w:eastAsiaTheme="majorEastAsia" w:cs="Times New Roman"/>
+        </w:rPr>
+      </w:pPr>
+      <w:r>
+        <w:rPr>
+          <w:rFonts w:eastAsiaTheme="majorEastAsia" w:cs="Times New Roman"/>
+        </w:rPr>
+        <w:br w:type="page"/>
+      </w:r>
+    </w:p>
+    <w:p>
+      <w:pPr>
+        <w:rPr>
+          <w:rFonts w:eastAsiaTheme="majorEastAsia" w:cs="Times New Roman"/>
           <w:b/>
           <w:bCs/>
           <w:sz w:val="32"/>
@@ -232,6 +339,7 @@
           <w:sz w:val="32"/>
           <w:szCs w:val="28"/>
         </w:rPr>
+        <w:lastRenderedPageBreak/>
         <w:t xml:space="preserve">1.2 </w:t>
       </w:r>
       <w:r>
@@ -1215,17 +1323,6 @@
         </w:rPr>
         <w:br w:type="page"/>
       </w:r>
-    </w:p>
-    <w:p>
-      <w:pPr>
-        <w:rPr>
-          <w:rFonts w:eastAsiaTheme="majorEastAsia" w:cs="Times New Roman"/>
-          <w:b/>
-          <w:bCs/>
-          <w:sz w:val="32"/>
-          <w:szCs w:val="28"/>
-        </w:rPr>
-      </w:pPr>
       <w:r>
         <w:rPr>
           <w:rFonts w:eastAsiaTheme="majorEastAsia" w:cs="Times New Roman"/>
@@ -3826,7 +3923,21 @@
         <w:rPr>
           <w:rFonts w:eastAsiaTheme="majorEastAsia" w:cs="Times New Roman"/>
         </w:rPr>
-        <w:t>is not a balanced benchmark for every traffic class. A high snow mAP may mainly reflect car-detection performance.</w:t>
+        <w:t xml:space="preserve">is not a balanced benchmark for every traffic class. A high snow </w:t>
+      </w:r>
+      <w:proofErr w:type="spellStart"/>
+      <w:r>
+        <w:rPr>
+          <w:rFonts w:eastAsiaTheme="majorEastAsia" w:cs="Times New Roman"/>
+        </w:rPr>
+        <w:t>mAP</w:t>
+      </w:r>
+      <w:proofErr w:type="spellEnd"/>
+      <w:r>
+        <w:rPr>
+          <w:rFonts w:eastAsiaTheme="majorEastAsia" w:cs="Times New Roman"/>
+        </w:rPr>
+        <w:t xml:space="preserve"> may mainly reflect car-detection performance.</w:t>
       </w:r>
     </w:p>
     <w:p>
@@ -3916,6 +4027,7 @@
         </w:rPr>
         <w:t xml:space="preserve">per-class </w:t>
       </w:r>
+      <w:proofErr w:type="spellStart"/>
       <w:r>
         <w:rPr>
           <w:rFonts w:eastAsiaTheme="majorEastAsia" w:cs="Times New Roman"/>
@@ -3926,7 +4038,14 @@
         <w:rPr>
           <w:rFonts w:eastAsiaTheme="majorEastAsia" w:cs="Times New Roman"/>
         </w:rPr>
-        <w:t xml:space="preserve">AP </w:t>
+        <w:t>AP</w:t>
+      </w:r>
+      <w:proofErr w:type="spellEnd"/>
+      <w:r>
+        <w:rPr>
+          <w:rFonts w:eastAsiaTheme="majorEastAsia" w:cs="Times New Roman"/>
+        </w:rPr>
+        <w:t xml:space="preserve"> </w:t>
       </w:r>
       <w:r>
         <w:rPr>
@@ -4220,8 +4339,16 @@
         <w:rPr>
           <w:rFonts w:eastAsiaTheme="majorEastAsia" w:cs="Times New Roman"/>
         </w:rPr>
-        <w:t>per-weather mAP</w:t>
-      </w:r>
+        <w:t xml:space="preserve">per-weather </w:t>
+      </w:r>
+      <w:proofErr w:type="spellStart"/>
+      <w:r>
+        <w:rPr>
+          <w:rFonts w:eastAsiaTheme="majorEastAsia" w:cs="Times New Roman"/>
+        </w:rPr>
+        <w:t>mAP</w:t>
+      </w:r>
+      <w:proofErr w:type="spellEnd"/>
     </w:p>
     <w:p>
       <w:pPr>
@@ -4357,7 +4484,21 @@
         <w:rPr>
           <w:rFonts w:eastAsiaTheme="majorEastAsia" w:cs="Times New Roman"/>
         </w:rPr>
-        <w:t>The protocol reports the mean and worst per-weather mAP across seven experiments.</w:t>
+        <w:t xml:space="preserve">The protocol reports the mean and worst per-weather </w:t>
+      </w:r>
+      <w:proofErr w:type="spellStart"/>
+      <w:r>
+        <w:rPr>
+          <w:rFonts w:eastAsiaTheme="majorEastAsia" w:cs="Times New Roman"/>
+        </w:rPr>
+        <w:t>mAP</w:t>
+      </w:r>
+      <w:proofErr w:type="spellEnd"/>
+      <w:r>
+        <w:rPr>
+          <w:rFonts w:eastAsiaTheme="majorEastAsia" w:cs="Times New Roman"/>
+        </w:rPr>
+        <w:t xml:space="preserve"> across seven experiments.</w:t>
       </w:r>
     </w:p>
     <w:p>
@@ -4380,7 +4521,31 @@
         <w:rPr>
           <w:rFonts w:eastAsiaTheme="majorEastAsia" w:cs="Times New Roman"/>
         </w:rPr>
-        <w:t xml:space="preserve">A similar optional experiment </w:t>
+        <w:t>O</w:t>
+      </w:r>
+      <w:r>
+        <w:rPr>
+          <w:rFonts w:eastAsiaTheme="majorEastAsia" w:cs="Times New Roman"/>
+        </w:rPr>
+        <w:t>ptional</w:t>
+      </w:r>
+      <w:r>
+        <w:rPr>
+          <w:rFonts w:eastAsiaTheme="majorEastAsia" w:cs="Times New Roman"/>
+        </w:rPr>
+        <w:t>:</w:t>
+      </w:r>
+      <w:r>
+        <w:rPr>
+          <w:rFonts w:eastAsiaTheme="majorEastAsia" w:cs="Times New Roman"/>
+        </w:rPr>
+        <w:t xml:space="preserve"> </w:t>
+      </w:r>
+      <w:r>
+        <w:rPr>
+          <w:rFonts w:eastAsiaTheme="majorEastAsia" w:cs="Times New Roman"/>
+        </w:rPr>
+        <w:t xml:space="preserve">A similar experiment </w:t>
       </w:r>
       <w:r>
         <w:rPr>
@@ -5223,6 +5388,32 @@
           <w:rFonts w:eastAsiaTheme="majorEastAsia"/>
         </w:rPr>
         <w:t>Table 1.4 shows YOLO26n’s results.</w:t>
+      </w:r>
+      <w:r>
+        <w:rPr>
+          <w:rFonts w:eastAsiaTheme="majorEastAsia"/>
+        </w:rPr>
+        <w:t xml:space="preserve"> </w:t>
+      </w:r>
+      <w:r>
+        <w:rPr>
+          <w:rFonts w:eastAsiaTheme="majorEastAsia"/>
+        </w:rPr>
+        <w:t xml:space="preserve">YOLO26n, YOLO26s, YOLO26m, YOLO26l, and YOLO26x are existing </w:t>
+      </w:r>
+      <w:proofErr w:type="spellStart"/>
+      <w:r>
+        <w:rPr>
+          <w:rFonts w:eastAsiaTheme="majorEastAsia"/>
+        </w:rPr>
+        <w:t>Ultralytics</w:t>
+      </w:r>
+      <w:proofErr w:type="spellEnd"/>
+      <w:r>
+        <w:rPr>
+          <w:rFonts w:eastAsiaTheme="majorEastAsia"/>
+        </w:rPr>
+        <w:t xml:space="preserve"> model scales used by XWOD as baseline detectors.</w:t>
       </w:r>
     </w:p>
     <w:p>
@@ -6647,8 +6838,16 @@
         <w:rPr>
           <w:rFonts w:eastAsiaTheme="majorEastAsia" w:cs="Times New Roman"/>
         </w:rPr>
-        <w:t>reported per-weather YOLO11m results</w:t>
-      </w:r>
+        <w:t xml:space="preserve">reported </w:t>
+      </w:r>
+      <w:proofErr w:type="gramStart"/>
+      <w:r>
+        <w:rPr>
+          <w:rFonts w:eastAsiaTheme="majorEastAsia" w:cs="Times New Roman"/>
+        </w:rPr>
+        <w:t>per-weather YOLO11m results</w:t>
+      </w:r>
+      <w:proofErr w:type="gramEnd"/>
       <w:r>
         <w:rPr>
           <w:rFonts w:eastAsiaTheme="majorEastAsia" w:cs="Times New Roman"/>
@@ -7433,11 +7632,19 @@
           <w:rFonts w:eastAsiaTheme="majorEastAsia" w:cs="Times New Roman"/>
         </w:rPr>
       </w:pPr>
-      <w:r>
-        <w:rPr>
-          <w:rFonts w:eastAsiaTheme="majorEastAsia" w:cs="Times New Roman"/>
-        </w:rPr>
-        <w:t>when it predicts an object, it is often correct</w:t>
+      <w:proofErr w:type="gramStart"/>
+      <w:r>
+        <w:rPr>
+          <w:rFonts w:eastAsiaTheme="majorEastAsia" w:cs="Times New Roman"/>
+        </w:rPr>
+        <w:t>when</w:t>
+      </w:r>
+      <w:proofErr w:type="gramEnd"/>
+      <w:r>
+        <w:rPr>
+          <w:rFonts w:eastAsiaTheme="majorEastAsia" w:cs="Times New Roman"/>
+        </w:rPr>
+        <w:t xml:space="preserve"> it predicts an object, it is often correct</w:t>
       </w:r>
     </w:p>
     <w:p>
@@ -7451,11 +7658,19 @@
           <w:rFonts w:eastAsiaTheme="majorEastAsia" w:cs="Times New Roman"/>
         </w:rPr>
       </w:pPr>
-      <w:r>
-        <w:rPr>
-          <w:rFonts w:eastAsiaTheme="majorEastAsia" w:cs="Times New Roman"/>
-        </w:rPr>
-        <w:t>however, it fails to detect many objects in snow</w:t>
+      <w:proofErr w:type="gramStart"/>
+      <w:r>
+        <w:rPr>
+          <w:rFonts w:eastAsiaTheme="majorEastAsia" w:cs="Times New Roman"/>
+        </w:rPr>
+        <w:t>however</w:t>
+      </w:r>
+      <w:proofErr w:type="gramEnd"/>
+      <w:r>
+        <w:rPr>
+          <w:rFonts w:eastAsiaTheme="majorEastAsia" w:cs="Times New Roman"/>
+        </w:rPr>
+        <w:t>, it fails to detect many objects in snow</w:t>
       </w:r>
     </w:p>
     <w:p>
@@ -7564,8 +7779,16 @@
         <w:rPr>
           <w:rFonts w:eastAsiaTheme="majorEastAsia" w:cs="Times New Roman"/>
         </w:rPr>
-        <w:t>YOLO26n per-weather mAP</w:t>
-      </w:r>
+        <w:t xml:space="preserve">YOLO26n per-weather </w:t>
+      </w:r>
+      <w:proofErr w:type="spellStart"/>
+      <w:r>
+        <w:rPr>
+          <w:rFonts w:eastAsiaTheme="majorEastAsia" w:cs="Times New Roman"/>
+        </w:rPr>
+        <w:t>mAP</w:t>
+      </w:r>
+      <w:proofErr w:type="spellEnd"/>
     </w:p>
     <w:p>
       <w:pPr>
@@ -8940,12 +9163,14 @@
                 <w:lang w:eastAsia="zh-TW"/>
               </w:rPr>
             </w:pPr>
+            <w:proofErr w:type="gramStart"/>
             <w:r>
               <w:rPr>
                 <w:rFonts w:eastAsiaTheme="majorEastAsia"/>
               </w:rPr>
               <w:t>Prove</w:t>
             </w:r>
+            <w:proofErr w:type="gramEnd"/>
             <w:r>
               <w:rPr>
                 <w:rFonts w:eastAsiaTheme="majorEastAsia"/>
@@ -9020,7 +9245,21 @@
               <w:rPr>
                 <w:rFonts w:eastAsiaTheme="majorEastAsia"/>
               </w:rPr>
-              <w:t xml:space="preserve"> have decent performance on both general and adverse weather</w:t>
+              <w:t xml:space="preserve"> </w:t>
+            </w:r>
+            <w:proofErr w:type="gramStart"/>
+            <w:r>
+              <w:rPr>
+                <w:rFonts w:eastAsiaTheme="majorEastAsia"/>
+              </w:rPr>
+              <w:t>have</w:t>
+            </w:r>
+            <w:proofErr w:type="gramEnd"/>
+            <w:r>
+              <w:rPr>
+                <w:rFonts w:eastAsiaTheme="majorEastAsia"/>
+              </w:rPr>
+              <w:t xml:space="preserve"> decent performance on both general and adverse weather</w:t>
             </w:r>
           </w:p>
         </w:tc>
@@ -9586,6 +9825,7 @@
         </w:rPr>
         <w:t xml:space="preserve">. </w:t>
       </w:r>
+      <w:proofErr w:type="spellStart"/>
       <w:r>
         <w:rPr>
           <w:rFonts w:eastAsiaTheme="majorEastAsia" w:cs="Times New Roman"/>
@@ -9606,6 +9846,7 @@
         </w:rPr>
         <w:t>runability</w:t>
       </w:r>
+      <w:proofErr w:type="spellEnd"/>
     </w:p>
     <w:p>
       <w:pPr>
@@ -9989,46 +10230,91 @@
     </w:p>
     <w:p/>
     <w:p>
-      <w:r>
-        <w:t xml:space="preserve">For each layer </w:t>
-      </w:r>
-      <w:r>
-        <w:t>i</w:t>
-      </w:r>
-      <w:r>
-        <w:t xml:space="preserve">, the </w:t>
-      </w:r>
-      <w:r>
-        <w:t>normalized</w:t>
-      </w:r>
-      <w:r>
-        <w:t xml:space="preserve"> </w:t>
-      </w:r>
-      <w:r>
-        <w:t>GEN accuracy drop is calculated as:</w:t>
-      </w:r>
-    </w:p>
-    <w:p>
+      <w:pPr>
+        <w:rPr>
+          <w:rFonts w:eastAsiaTheme="majorEastAsia"/>
+          <w:b/>
+          <w:bCs/>
+        </w:rPr>
+      </w:pPr>
+      <w:r>
+        <w:rPr>
+          <w:rFonts w:eastAsiaTheme="majorEastAsia"/>
+          <w:b/>
+          <w:bCs/>
+        </w:rPr>
+        <w:t>Normalized GEN</w:t>
+      </w:r>
+      <w:r>
+        <w:rPr>
+          <w:rFonts w:eastAsiaTheme="majorEastAsia"/>
+          <w:b/>
+          <w:bCs/>
+        </w:rPr>
+        <w:t xml:space="preserve"> / SNOW</w:t>
+      </w:r>
+      <w:r>
+        <w:rPr>
+          <w:rFonts w:eastAsiaTheme="majorEastAsia"/>
+          <w:b/>
+          <w:bCs/>
+        </w:rPr>
+        <w:t xml:space="preserve"> Accuracy Drop</w:t>
+      </w:r>
+    </w:p>
+    <w:p>
+      <w:pPr>
+        <w:rPr>
+          <w:rFonts w:eastAsiaTheme="majorEastAsia"/>
+        </w:rPr>
+      </w:pPr>
+      <w:r>
+        <w:rPr>
+          <w:rFonts w:eastAsiaTheme="majorEastAsia"/>
+        </w:rPr>
+        <w:t xml:space="preserve">For each pruning group </w:t>
+      </w:r>
+      <m:oMath>
+        <m:r>
+          <w:rPr>
+            <w:rFonts w:ascii="Cambria Math" w:eastAsiaTheme="majorEastAsia" w:hAnsi="Cambria Math"/>
+          </w:rPr>
+          <m:t>i</m:t>
+        </m:r>
+      </m:oMath>
+      <w:r>
+        <w:rPr>
+          <w:rFonts w:eastAsiaTheme="majorEastAsia"/>
+        </w:rPr>
+        <w:t>, the normalized accuracy drop measures the relative accuracy loss after pruning.</w:t>
+      </w:r>
+    </w:p>
+    <w:p>
+      <w:pPr>
+        <w:rPr>
+          <w:rFonts w:eastAsiaTheme="majorEastAsia"/>
+        </w:rPr>
+      </w:pPr>
       <m:oMathPara>
         <m:oMath>
           <m:r>
             <w:rPr>
-              <w:rFonts w:ascii="Cambria Math" w:hAnsi="Cambria Math"/>
+              <w:rFonts w:ascii="Cambria Math" w:eastAsiaTheme="majorEastAsia" w:hAnsi="Cambria Math"/>
             </w:rPr>
-            <m:t>A</m:t>
+            <m:t>NA</m:t>
           </m:r>
           <m:sSub>
             <m:sSubPr>
               <m:ctrlPr>
                 <w:rPr>
-                  <w:rFonts w:ascii="Cambria Math" w:hAnsi="Cambria Math"/>
+                  <w:rFonts w:ascii="Cambria Math" w:eastAsiaTheme="majorEastAsia" w:hAnsi="Cambria Math"/>
                 </w:rPr>
               </m:ctrlPr>
             </m:sSubPr>
             <m:e>
               <m:r>
                 <w:rPr>
-                  <w:rFonts w:ascii="Cambria Math" w:hAnsi="Cambria Math"/>
+                  <w:rFonts w:ascii="Cambria Math" w:eastAsiaTheme="majorEastAsia" w:hAnsi="Cambria Math"/>
                 </w:rPr>
                 <m:t>D</m:t>
               </m:r>
@@ -10039,13 +10325,13 @@
                   <m:sty m:val="p"/>
                 </m:rPr>
                 <w:rPr>
-                  <w:rFonts w:ascii="Cambria Math" w:hAnsi="Cambria Math"/>
+                  <w:rFonts w:ascii="Cambria Math" w:eastAsiaTheme="majorEastAsia" w:hAnsi="Cambria Math"/>
                 </w:rPr>
                 <m:t>GEN</m:t>
               </m:r>
               <m:r>
                 <w:rPr>
-                  <w:rFonts w:ascii="Cambria Math" w:hAnsi="Cambria Math"/>
+                  <w:rFonts w:ascii="Cambria Math" w:eastAsiaTheme="majorEastAsia" w:hAnsi="Cambria Math"/>
                 </w:rPr>
                 <m:t>,i</m:t>
               </m:r>
@@ -10053,125 +10339,197 @@
           </m:sSub>
           <m:r>
             <w:rPr>
-              <w:rFonts w:ascii="Cambria Math" w:hAnsi="Cambria Math"/>
+              <w:rFonts w:ascii="Cambria Math" w:eastAsiaTheme="majorEastAsia" w:hAnsi="Cambria Math"/>
             </w:rPr>
-            <m:t>=mA</m:t>
+            <m:t>=</m:t>
           </m:r>
-          <m:sSub>
-            <m:sSubPr>
+          <m:f>
+            <m:fPr>
               <m:ctrlPr>
                 <w:rPr>
-                  <w:rFonts w:ascii="Cambria Math" w:hAnsi="Cambria Math"/>
+                  <w:rFonts w:ascii="Cambria Math" w:eastAsiaTheme="majorEastAsia" w:hAnsi="Cambria Math"/>
                 </w:rPr>
               </m:ctrlPr>
-            </m:sSubPr>
-            <m:e>
+            </m:fPr>
+            <m:num>
               <m:r>
                 <w:rPr>
-                  <w:rFonts w:ascii="Cambria Math" w:hAnsi="Cambria Math"/>
+                  <w:rFonts w:ascii="Cambria Math" w:eastAsiaTheme="majorEastAsia" w:hAnsi="Cambria Math"/>
                 </w:rPr>
-                <m:t>P</m:t>
+                <m:t>mA</m:t>
               </m:r>
-            </m:e>
-            <m:sub>
-              <m:r>
-                <m:rPr>
-                  <m:sty m:val="p"/>
-                </m:rPr>
-                <w:rPr>
-                  <w:rFonts w:ascii="Cambria Math" w:hAnsi="Cambria Math"/>
-                </w:rPr>
-                <m:t>GEN</m:t>
-              </m:r>
+              <m:sSub>
+                <m:sSubPr>
+                  <m:ctrlPr>
+                    <w:rPr>
+                      <w:rFonts w:ascii="Cambria Math" w:eastAsiaTheme="majorEastAsia" w:hAnsi="Cambria Math"/>
+                    </w:rPr>
+                  </m:ctrlPr>
+                </m:sSubPr>
+                <m:e>
+                  <m:r>
+                    <w:rPr>
+                      <w:rFonts w:ascii="Cambria Math" w:eastAsiaTheme="majorEastAsia" w:hAnsi="Cambria Math"/>
+                    </w:rPr>
+                    <m:t>P</m:t>
+                  </m:r>
+                </m:e>
+                <m:sub>
+                  <m:r>
+                    <m:rPr>
+                      <m:sty m:val="p"/>
+                    </m:rPr>
+                    <w:rPr>
+                      <w:rFonts w:ascii="Cambria Math" w:eastAsiaTheme="majorEastAsia" w:hAnsi="Cambria Math"/>
+                    </w:rPr>
+                    <m:t>GEN</m:t>
+                  </m:r>
+                  <m:r>
+                    <w:rPr>
+                      <w:rFonts w:ascii="Cambria Math" w:eastAsiaTheme="majorEastAsia" w:hAnsi="Cambria Math"/>
+                    </w:rPr>
+                    <m:t>,</m:t>
+                  </m:r>
+                  <m:r>
+                    <m:rPr>
+                      <m:sty m:val="p"/>
+                    </m:rPr>
+                    <w:rPr>
+                      <w:rFonts w:ascii="Cambria Math" w:eastAsiaTheme="majorEastAsia" w:hAnsi="Cambria Math"/>
+                    </w:rPr>
+                    <m:t>baseline</m:t>
+                  </m:r>
+                </m:sub>
+              </m:sSub>
               <m:r>
                 <w:rPr>
-                  <w:rFonts w:ascii="Cambria Math" w:hAnsi="Cambria Math"/>
+                  <w:rFonts w:ascii="Cambria Math" w:eastAsiaTheme="majorEastAsia" w:hAnsi="Cambria Math"/>
                 </w:rPr>
-                <m:t>,</m:t>
+                <m:t>-mA</m:t>
               </m:r>
-              <m:r>
-                <m:rPr>
-                  <m:sty m:val="p"/>
-                </m:rPr>
-                <w:rPr>
-                  <w:rFonts w:ascii="Cambria Math" w:hAnsi="Cambria Math"/>
-                </w:rPr>
-                <m:t>baseline</m:t>
-              </m:r>
-            </m:sub>
-          </m:sSub>
-          <m:r>
-            <w:rPr>
-              <w:rFonts w:ascii="Cambria Math" w:hAnsi="Cambria Math"/>
-            </w:rPr>
-            <m:t>-mA</m:t>
-          </m:r>
-          <m:sSub>
-            <m:sSubPr>
-              <m:ctrlPr>
-                <w:rPr>
-                  <w:rFonts w:ascii="Cambria Math" w:hAnsi="Cambria Math"/>
-                </w:rPr>
-              </m:ctrlPr>
-            </m:sSubPr>
-            <m:e>
+              <m:sSub>
+                <m:sSubPr>
+                  <m:ctrlPr>
+                    <w:rPr>
+                      <w:rFonts w:ascii="Cambria Math" w:eastAsiaTheme="majorEastAsia" w:hAnsi="Cambria Math"/>
+                    </w:rPr>
+                  </m:ctrlPr>
+                </m:sSubPr>
+                <m:e>
+                  <m:r>
+                    <w:rPr>
+                      <w:rFonts w:ascii="Cambria Math" w:eastAsiaTheme="majorEastAsia" w:hAnsi="Cambria Math"/>
+                    </w:rPr>
+                    <m:t>P</m:t>
+                  </m:r>
+                </m:e>
+                <m:sub>
+                  <m:r>
+                    <m:rPr>
+                      <m:sty m:val="p"/>
+                    </m:rPr>
+                    <w:rPr>
+                      <w:rFonts w:ascii="Cambria Math" w:eastAsiaTheme="majorEastAsia" w:hAnsi="Cambria Math"/>
+                    </w:rPr>
+                    <m:t>GEN</m:t>
+                  </m:r>
+                  <m:r>
+                    <w:rPr>
+                      <w:rFonts w:ascii="Cambria Math" w:eastAsiaTheme="majorEastAsia" w:hAnsi="Cambria Math"/>
+                    </w:rPr>
+                    <m:t>,</m:t>
+                  </m:r>
+                  <m:r>
+                    <m:rPr>
+                      <m:sty m:val="p"/>
+                    </m:rPr>
+                    <w:rPr>
+                      <w:rFonts w:ascii="Cambria Math" w:eastAsiaTheme="majorEastAsia" w:hAnsi="Cambria Math"/>
+                    </w:rPr>
+                    <m:t>pruned</m:t>
+                  </m:r>
+                  <m:r>
+                    <w:rPr>
+                      <w:rFonts w:ascii="Cambria Math" w:eastAsiaTheme="majorEastAsia" w:hAnsi="Cambria Math"/>
+                    </w:rPr>
+                    <m:t>,i</m:t>
+                  </m:r>
+                </m:sub>
+              </m:sSub>
+            </m:num>
+            <m:den>
               <m:r>
                 <w:rPr>
-                  <w:rFonts w:ascii="Cambria Math" w:hAnsi="Cambria Math"/>
+                  <w:rFonts w:ascii="Cambria Math" w:eastAsiaTheme="majorEastAsia" w:hAnsi="Cambria Math"/>
                 </w:rPr>
-                <m:t>P</m:t>
+                <m:t>mA</m:t>
               </m:r>
-            </m:e>
-            <m:sub>
-              <m:r>
-                <m:rPr>
-                  <m:sty m:val="p"/>
-                </m:rPr>
-                <w:rPr>
-                  <w:rFonts w:ascii="Cambria Math" w:hAnsi="Cambria Math"/>
-                </w:rPr>
-                <m:t>GEN</m:t>
-              </m:r>
-              <m:r>
-                <w:rPr>
-                  <w:rFonts w:ascii="Cambria Math" w:hAnsi="Cambria Math"/>
-                </w:rPr>
-                <m:t>,</m:t>
-              </m:r>
-              <m:r>
-                <m:rPr>
-                  <m:sty m:val="p"/>
-                </m:rPr>
-                <w:rPr>
-                  <w:rFonts w:ascii="Cambria Math" w:hAnsi="Cambria Math"/>
-                </w:rPr>
-                <m:t>pruned</m:t>
-              </m:r>
-              <m:r>
-                <w:rPr>
-                  <w:rFonts w:ascii="Cambria Math" w:hAnsi="Cambria Math"/>
-                </w:rPr>
-                <m:t>,i</m:t>
-              </m:r>
-            </m:sub>
-          </m:sSub>
+              <m:sSub>
+                <m:sSubPr>
+                  <m:ctrlPr>
+                    <w:rPr>
+                      <w:rFonts w:ascii="Cambria Math" w:eastAsiaTheme="majorEastAsia" w:hAnsi="Cambria Math"/>
+                    </w:rPr>
+                  </m:ctrlPr>
+                </m:sSubPr>
+                <m:e>
+                  <m:r>
+                    <w:rPr>
+                      <w:rFonts w:ascii="Cambria Math" w:eastAsiaTheme="majorEastAsia" w:hAnsi="Cambria Math"/>
+                    </w:rPr>
+                    <m:t>P</m:t>
+                  </m:r>
+                </m:e>
+                <m:sub>
+                  <m:r>
+                    <m:rPr>
+                      <m:sty m:val="p"/>
+                    </m:rPr>
+                    <w:rPr>
+                      <w:rFonts w:ascii="Cambria Math" w:eastAsiaTheme="majorEastAsia" w:hAnsi="Cambria Math"/>
+                    </w:rPr>
+                    <m:t>GEN</m:t>
+                  </m:r>
+                  <m:r>
+                    <w:rPr>
+                      <w:rFonts w:ascii="Cambria Math" w:eastAsiaTheme="majorEastAsia" w:hAnsi="Cambria Math"/>
+                    </w:rPr>
+                    <m:t>,</m:t>
+                  </m:r>
+                  <m:r>
+                    <m:rPr>
+                      <m:sty m:val="p"/>
+                    </m:rPr>
+                    <w:rPr>
+                      <w:rFonts w:ascii="Cambria Math" w:eastAsiaTheme="majorEastAsia" w:hAnsi="Cambria Math"/>
+                    </w:rPr>
+                    <m:t>baseline</m:t>
+                  </m:r>
+                </m:sub>
+              </m:sSub>
+            </m:den>
+          </m:f>
         </m:oMath>
       </m:oMathPara>
     </w:p>
     <w:p>
       <w:pPr>
         <w:rPr>
-          <w:b/>
-          <w:bCs/>
-          <w:sz w:val="32"/>
-          <w:szCs w:val="28"/>
+          <w:rFonts w:eastAsiaTheme="majorEastAsia"/>
+        </w:rPr>
+      </w:pPr>
+    </w:p>
+    <w:p>
+      <w:pPr>
+        <w:rPr>
+          <w:rFonts w:eastAsiaTheme="majorEastAsia"/>
         </w:rPr>
       </w:pPr>
       <m:oMathPara>
         <m:oMath>
           <m:r>
             <w:rPr>
-              <w:rFonts w:ascii="Cambria Math" w:hAnsi="Cambria Math"/>
+              <w:rFonts w:ascii="Cambria Math" w:eastAsiaTheme="majorEastAsia" w:hAnsi="Cambria Math"/>
             </w:rPr>
             <m:t>NA</m:t>
           </m:r>
@@ -10179,14 +10537,14 @@
             <m:sSubPr>
               <m:ctrlPr>
                 <w:rPr>
-                  <w:rFonts w:ascii="Cambria Math" w:hAnsi="Cambria Math"/>
+                  <w:rFonts w:ascii="Cambria Math" w:eastAsiaTheme="majorEastAsia" w:hAnsi="Cambria Math"/>
                 </w:rPr>
               </m:ctrlPr>
             </m:sSubPr>
             <m:e>
               <m:r>
                 <w:rPr>
-                  <w:rFonts w:ascii="Cambria Math" w:hAnsi="Cambria Math"/>
+                  <w:rFonts w:ascii="Cambria Math" w:eastAsiaTheme="majorEastAsia" w:hAnsi="Cambria Math"/>
                 </w:rPr>
                 <m:t>D</m:t>
               </m:r>
@@ -10197,13 +10555,13 @@
                   <m:sty m:val="p"/>
                 </m:rPr>
                 <w:rPr>
-                  <w:rFonts w:ascii="Cambria Math" w:hAnsi="Cambria Math"/>
+                  <w:rFonts w:ascii="Cambria Math" w:eastAsiaTheme="majorEastAsia" w:hAnsi="Cambria Math"/>
                 </w:rPr>
-                <m:t>GEN</m:t>
+                <m:t>SNOW</m:t>
               </m:r>
               <m:r>
                 <w:rPr>
-                  <w:rFonts w:ascii="Cambria Math" w:hAnsi="Cambria Math"/>
+                  <w:rFonts w:ascii="Cambria Math" w:eastAsiaTheme="majorEastAsia" w:hAnsi="Cambria Math"/>
                 </w:rPr>
                 <m:t>,i</m:t>
               </m:r>
@@ -10211,7 +10569,7 @@
           </m:sSub>
           <m:r>
             <w:rPr>
-              <w:rFonts w:ascii="Cambria Math" w:hAnsi="Cambria Math"/>
+              <w:rFonts w:ascii="Cambria Math" w:eastAsiaTheme="majorEastAsia" w:hAnsi="Cambria Math"/>
             </w:rPr>
             <m:t>=</m:t>
           </m:r>
@@ -10219,30 +10577,323 @@
             <m:fPr>
               <m:ctrlPr>
                 <w:rPr>
-                  <w:rFonts w:ascii="Cambria Math" w:hAnsi="Cambria Math"/>
-                  <w:i/>
+                  <w:rFonts w:ascii="Cambria Math" w:eastAsiaTheme="majorEastAsia" w:hAnsi="Cambria Math"/>
                 </w:rPr>
               </m:ctrlPr>
             </m:fPr>
             <m:num>
               <m:r>
                 <w:rPr>
-                  <w:rFonts w:ascii="Cambria Math" w:hAnsi="Cambria Math"/>
+                  <w:rFonts w:ascii="Cambria Math" w:eastAsiaTheme="majorEastAsia" w:hAnsi="Cambria Math"/>
                 </w:rPr>
-                <m:t>A</m:t>
+                <m:t>mA</m:t>
               </m:r>
               <m:sSub>
                 <m:sSubPr>
                   <m:ctrlPr>
                     <w:rPr>
-                      <w:rFonts w:ascii="Cambria Math" w:hAnsi="Cambria Math"/>
+                      <w:rFonts w:ascii="Cambria Math" w:eastAsiaTheme="majorEastAsia" w:hAnsi="Cambria Math"/>
                     </w:rPr>
                   </m:ctrlPr>
                 </m:sSubPr>
                 <m:e>
                   <m:r>
                     <w:rPr>
-                      <w:rFonts w:ascii="Cambria Math" w:hAnsi="Cambria Math"/>
+                      <w:rFonts w:ascii="Cambria Math" w:eastAsiaTheme="majorEastAsia" w:hAnsi="Cambria Math"/>
+                    </w:rPr>
+                    <m:t>P</m:t>
+                  </m:r>
+                </m:e>
+                <m:sub>
+                  <m:r>
+                    <m:rPr>
+                      <m:sty m:val="p"/>
+                    </m:rPr>
+                    <w:rPr>
+                      <w:rFonts w:ascii="Cambria Math" w:eastAsiaTheme="majorEastAsia" w:hAnsi="Cambria Math"/>
+                    </w:rPr>
+                    <m:t>SNOW</m:t>
+                  </m:r>
+                  <m:r>
+                    <w:rPr>
+                      <w:rFonts w:ascii="Cambria Math" w:eastAsiaTheme="majorEastAsia" w:hAnsi="Cambria Math"/>
+                    </w:rPr>
+                    <m:t>,</m:t>
+                  </m:r>
+                  <m:r>
+                    <m:rPr>
+                      <m:sty m:val="p"/>
+                    </m:rPr>
+                    <w:rPr>
+                      <w:rFonts w:ascii="Cambria Math" w:eastAsiaTheme="majorEastAsia" w:hAnsi="Cambria Math"/>
+                    </w:rPr>
+                    <m:t>baseline</m:t>
+                  </m:r>
+                </m:sub>
+              </m:sSub>
+              <m:r>
+                <w:rPr>
+                  <w:rFonts w:ascii="Cambria Math" w:eastAsiaTheme="majorEastAsia" w:hAnsi="Cambria Math"/>
+                </w:rPr>
+                <m:t>-mA</m:t>
+              </m:r>
+              <m:sSub>
+                <m:sSubPr>
+                  <m:ctrlPr>
+                    <w:rPr>
+                      <w:rFonts w:ascii="Cambria Math" w:eastAsiaTheme="majorEastAsia" w:hAnsi="Cambria Math"/>
+                    </w:rPr>
+                  </m:ctrlPr>
+                </m:sSubPr>
+                <m:e>
+                  <m:r>
+                    <w:rPr>
+                      <w:rFonts w:ascii="Cambria Math" w:eastAsiaTheme="majorEastAsia" w:hAnsi="Cambria Math"/>
+                    </w:rPr>
+                    <m:t>P</m:t>
+                  </m:r>
+                </m:e>
+                <m:sub>
+                  <m:r>
+                    <m:rPr>
+                      <m:sty m:val="p"/>
+                    </m:rPr>
+                    <w:rPr>
+                      <w:rFonts w:ascii="Cambria Math" w:eastAsiaTheme="majorEastAsia" w:hAnsi="Cambria Math"/>
+                    </w:rPr>
+                    <m:t>SNOW</m:t>
+                  </m:r>
+                  <m:r>
+                    <w:rPr>
+                      <w:rFonts w:ascii="Cambria Math" w:eastAsiaTheme="majorEastAsia" w:hAnsi="Cambria Math"/>
+                    </w:rPr>
+                    <m:t>,</m:t>
+                  </m:r>
+                  <m:r>
+                    <m:rPr>
+                      <m:sty m:val="p"/>
+                    </m:rPr>
+                    <w:rPr>
+                      <w:rFonts w:ascii="Cambria Math" w:eastAsiaTheme="majorEastAsia" w:hAnsi="Cambria Math"/>
+                    </w:rPr>
+                    <m:t>pruned</m:t>
+                  </m:r>
+                  <m:r>
+                    <w:rPr>
+                      <w:rFonts w:ascii="Cambria Math" w:eastAsiaTheme="majorEastAsia" w:hAnsi="Cambria Math"/>
+                    </w:rPr>
+                    <m:t>,i</m:t>
+                  </m:r>
+                </m:sub>
+              </m:sSub>
+            </m:num>
+            <m:den>
+              <m:r>
+                <w:rPr>
+                  <w:rFonts w:ascii="Cambria Math" w:eastAsiaTheme="majorEastAsia" w:hAnsi="Cambria Math"/>
+                </w:rPr>
+                <m:t>mA</m:t>
+              </m:r>
+              <m:sSub>
+                <m:sSubPr>
+                  <m:ctrlPr>
+                    <w:rPr>
+                      <w:rFonts w:ascii="Cambria Math" w:eastAsiaTheme="majorEastAsia" w:hAnsi="Cambria Math"/>
+                    </w:rPr>
+                  </m:ctrlPr>
+                </m:sSubPr>
+                <m:e>
+                  <m:r>
+                    <w:rPr>
+                      <w:rFonts w:ascii="Cambria Math" w:eastAsiaTheme="majorEastAsia" w:hAnsi="Cambria Math"/>
+                    </w:rPr>
+                    <m:t>P</m:t>
+                  </m:r>
+                </m:e>
+                <m:sub>
+                  <m:r>
+                    <m:rPr>
+                      <m:sty m:val="p"/>
+                    </m:rPr>
+                    <w:rPr>
+                      <w:rFonts w:ascii="Cambria Math" w:eastAsiaTheme="majorEastAsia" w:hAnsi="Cambria Math"/>
+                    </w:rPr>
+                    <m:t>SNOW</m:t>
+                  </m:r>
+                  <m:r>
+                    <w:rPr>
+                      <w:rFonts w:ascii="Cambria Math" w:eastAsiaTheme="majorEastAsia" w:hAnsi="Cambria Math"/>
+                    </w:rPr>
+                    <m:t>,</m:t>
+                  </m:r>
+                  <m:r>
+                    <m:rPr>
+                      <m:sty m:val="p"/>
+                    </m:rPr>
+                    <w:rPr>
+                      <w:rFonts w:ascii="Cambria Math" w:eastAsiaTheme="majorEastAsia" w:hAnsi="Cambria Math"/>
+                    </w:rPr>
+                    <m:t>baseline</m:t>
+                  </m:r>
+                </m:sub>
+              </m:sSub>
+            </m:den>
+          </m:f>
+        </m:oMath>
+      </m:oMathPara>
+    </w:p>
+    <w:p>
+      <w:pPr>
+        <w:rPr>
+          <w:rFonts w:eastAsiaTheme="majorEastAsia"/>
+        </w:rPr>
+      </w:pPr>
+    </w:p>
+    <w:p>
+      <w:pPr>
+        <w:rPr>
+          <w:rFonts w:eastAsiaTheme="majorEastAsia"/>
+          <w:b/>
+          <w:bCs/>
+        </w:rPr>
+      </w:pPr>
+      <w:r>
+        <w:rPr>
+          <w:rFonts w:eastAsiaTheme="majorEastAsia"/>
+          <w:b/>
+          <w:bCs/>
+        </w:rPr>
+        <w:t>Non-Negative GEN</w:t>
+      </w:r>
+      <w:r>
+        <w:rPr>
+          <w:rFonts w:eastAsiaTheme="majorEastAsia"/>
+          <w:b/>
+          <w:bCs/>
+        </w:rPr>
+        <w:t xml:space="preserve"> / SNOW</w:t>
+      </w:r>
+      <w:r>
+        <w:rPr>
+          <w:rFonts w:eastAsiaTheme="majorEastAsia"/>
+          <w:b/>
+          <w:bCs/>
+        </w:rPr>
+        <w:t xml:space="preserve"> Damage</w:t>
+      </w:r>
+    </w:p>
+    <w:p>
+      <w:pPr>
+        <w:rPr>
+          <w:rFonts w:eastAsiaTheme="majorEastAsia"/>
+        </w:rPr>
+      </w:pPr>
+      <w:r>
+        <w:rPr>
+          <w:rFonts w:eastAsiaTheme="majorEastAsia"/>
+        </w:rPr>
+        <w:t>The damage is clipped to zero so that an accuracy improvement is not treated as negative damage.</w:t>
+      </w:r>
+    </w:p>
+    <w:p>
+      <w:pPr>
+        <w:rPr>
+          <w:rFonts w:eastAsiaTheme="majorEastAsia"/>
+        </w:rPr>
+      </w:pPr>
+      <m:oMathPara>
+        <m:oMath>
+          <m:sSub>
+            <m:sSubPr>
+              <m:ctrlPr>
+                <w:rPr>
+                  <w:rFonts w:ascii="Cambria Math" w:eastAsiaTheme="majorEastAsia" w:hAnsi="Cambria Math"/>
+                </w:rPr>
+              </m:ctrlPr>
+            </m:sSubPr>
+            <m:e>
+              <m:r>
+                <w:rPr>
+                  <w:rFonts w:ascii="Cambria Math" w:eastAsiaTheme="majorEastAsia" w:hAnsi="Cambria Math"/>
+                </w:rPr>
+                <m:t>h</m:t>
+              </m:r>
+            </m:e>
+            <m:sub>
+              <m:r>
+                <m:rPr>
+                  <m:sty m:val="p"/>
+                </m:rPr>
+                <w:rPr>
+                  <w:rFonts w:ascii="Cambria Math" w:eastAsiaTheme="majorEastAsia" w:hAnsi="Cambria Math"/>
+                </w:rPr>
+                <m:t>GEN</m:t>
+              </m:r>
+              <m:r>
+                <w:rPr>
+                  <w:rFonts w:ascii="Cambria Math" w:eastAsiaTheme="majorEastAsia" w:hAnsi="Cambria Math"/>
+                </w:rPr>
+                <m:t>,i</m:t>
+              </m:r>
+            </m:sub>
+          </m:sSub>
+          <m:r>
+            <w:rPr>
+              <w:rFonts w:ascii="Cambria Math" w:eastAsiaTheme="majorEastAsia" w:hAnsi="Cambria Math"/>
+            </w:rPr>
+            <m:t>=</m:t>
+          </m:r>
+          <m:r>
+            <m:rPr>
+              <m:sty m:val="p"/>
+            </m:rPr>
+            <w:rPr>
+              <w:rFonts w:ascii="Cambria Math" w:eastAsiaTheme="majorEastAsia" w:hAnsi="Cambria Math"/>
+            </w:rPr>
+            <m:t>max</m:t>
+          </m:r>
+          <m:r>
+            <w:rPr>
+              <w:rFonts w:ascii="Cambria Math" w:eastAsiaTheme="majorEastAsia" w:hAnsi="Cambria Math"/>
+            </w:rPr>
+            <m:t>⁡</m:t>
+          </m:r>
+          <m:d>
+            <m:dPr>
+              <m:sepChr m:val=","/>
+              <m:ctrlPr>
+                <w:rPr>
+                  <w:rFonts w:ascii="Cambria Math" w:eastAsiaTheme="majorEastAsia" w:hAnsi="Cambria Math"/>
+                </w:rPr>
+              </m:ctrlPr>
+            </m:dPr>
+            <m:e>
+              <m:r>
+                <w:rPr>
+                  <w:rFonts w:ascii="Cambria Math" w:eastAsiaTheme="majorEastAsia" w:hAnsi="Cambria Math"/>
+                </w:rPr>
+                <m:t>0</m:t>
+              </m:r>
+            </m:e>
+            <m:e>
+              <m:r>
+                <w:rPr>
+                  <w:rFonts w:ascii="Cambria Math" w:eastAsiaTheme="majorEastAsia" w:hAnsi="Cambria Math"/>
+                </w:rPr>
+                <m:t>NA</m:t>
+              </m:r>
+              <m:sSub>
+                <m:sSubPr>
+                  <m:ctrlPr>
+                    <w:rPr>
+                      <w:rFonts w:ascii="Cambria Math" w:eastAsiaTheme="majorEastAsia" w:hAnsi="Cambria Math"/>
+                    </w:rPr>
+                  </m:ctrlPr>
+                </m:sSubPr>
+                <m:e>
+                  <m:r>
+                    <w:rPr>
+                      <w:rFonts w:ascii="Cambria Math" w:eastAsiaTheme="majorEastAsia" w:hAnsi="Cambria Math"/>
                     </w:rPr>
                     <m:t>D</m:t>
                   </m:r>
@@ -10253,111 +10904,52 @@
                       <m:sty m:val="p"/>
                     </m:rPr>
                     <w:rPr>
-                      <w:rFonts w:ascii="Cambria Math" w:hAnsi="Cambria Math"/>
+                      <w:rFonts w:ascii="Cambria Math" w:eastAsiaTheme="majorEastAsia" w:hAnsi="Cambria Math"/>
                     </w:rPr>
                     <m:t>GEN</m:t>
                   </m:r>
                   <m:r>
                     <w:rPr>
-                      <w:rFonts w:ascii="Cambria Math" w:hAnsi="Cambria Math"/>
+                      <w:rFonts w:ascii="Cambria Math" w:eastAsiaTheme="majorEastAsia" w:hAnsi="Cambria Math"/>
                     </w:rPr>
                     <m:t>,i</m:t>
                   </m:r>
                 </m:sub>
               </m:sSub>
-            </m:num>
-            <m:den>
-              <m:r>
-                <w:rPr>
-                  <w:rFonts w:ascii="Cambria Math" w:hAnsi="Cambria Math"/>
-                </w:rPr>
-                <m:t>mA</m:t>
-              </m:r>
-              <m:sSub>
-                <m:sSubPr>
-                  <m:ctrlPr>
-                    <w:rPr>
-                      <w:rFonts w:ascii="Cambria Math" w:hAnsi="Cambria Math"/>
-                    </w:rPr>
-                  </m:ctrlPr>
-                </m:sSubPr>
-                <m:e>
-                  <m:r>
-                    <w:rPr>
-                      <w:rFonts w:ascii="Cambria Math" w:hAnsi="Cambria Math"/>
-                    </w:rPr>
-                    <m:t>P</m:t>
-                  </m:r>
-                </m:e>
-                <m:sub>
-                  <m:r>
-                    <m:rPr>
-                      <m:sty m:val="p"/>
-                    </m:rPr>
-                    <w:rPr>
-                      <w:rFonts w:ascii="Cambria Math" w:hAnsi="Cambria Math"/>
-                    </w:rPr>
-                    <m:t>GEN</m:t>
-                  </m:r>
-                  <m:r>
-                    <w:rPr>
-                      <w:rFonts w:ascii="Cambria Math" w:hAnsi="Cambria Math"/>
-                    </w:rPr>
-                    <m:t>,</m:t>
-                  </m:r>
-                  <m:r>
-                    <m:rPr>
-                      <m:sty m:val="p"/>
-                    </m:rPr>
-                    <w:rPr>
-                      <w:rFonts w:ascii="Cambria Math" w:hAnsi="Cambria Math"/>
-                    </w:rPr>
-                    <m:t>baseline</m:t>
-                  </m:r>
-                </m:sub>
-              </m:sSub>
-            </m:den>
-          </m:f>
+            </m:e>
+          </m:d>
         </m:oMath>
       </m:oMathPara>
     </w:p>
     <w:p>
-      <w:r>
-        <w:t>The</w:t>
-      </w:r>
-      <w:r>
-        <w:t xml:space="preserve"> </w:t>
-      </w:r>
-      <w:r>
-        <w:t>normalized</w:t>
-      </w:r>
-      <w:r>
-        <w:t xml:space="preserve"> SNOW accuracy drop is calculated as:</w:t>
-      </w:r>
-    </w:p>
-    <w:p>
+      <w:pPr>
+        <w:rPr>
+          <w:rFonts w:eastAsiaTheme="majorEastAsia"/>
+        </w:rPr>
+      </w:pPr>
+    </w:p>
+    <w:p>
+      <w:pPr>
+        <w:rPr>
+          <w:rFonts w:eastAsiaTheme="majorEastAsia"/>
+        </w:rPr>
+      </w:pPr>
       <m:oMathPara>
         <m:oMath>
-          <m:r>
-            <w:rPr>
-              <w:rFonts w:ascii="Cambria Math" w:hAnsi="Cambria Math"/>
-            </w:rPr>
-            <m:t>A</m:t>
-          </m:r>
           <m:sSub>
             <m:sSubPr>
               <m:ctrlPr>
                 <w:rPr>
-                  <w:rFonts w:ascii="Cambria Math" w:hAnsi="Cambria Math"/>
+                  <w:rFonts w:ascii="Cambria Math" w:eastAsiaTheme="majorEastAsia" w:hAnsi="Cambria Math"/>
                 </w:rPr>
               </m:ctrlPr>
             </m:sSubPr>
             <m:e>
               <m:r>
                 <w:rPr>
-                  <w:rFonts w:ascii="Cambria Math" w:hAnsi="Cambria Math"/>
+                  <w:rFonts w:ascii="Cambria Math" w:eastAsiaTheme="majorEastAsia" w:hAnsi="Cambria Math"/>
                 </w:rPr>
-                <m:t>D</m:t>
+                <m:t>h</m:t>
               </m:r>
             </m:e>
             <m:sub>
@@ -10366,13 +10958,13 @@
                   <m:sty m:val="p"/>
                 </m:rPr>
                 <w:rPr>
-                  <w:rFonts w:ascii="Cambria Math" w:hAnsi="Cambria Math"/>
+                  <w:rFonts w:ascii="Cambria Math" w:eastAsiaTheme="majorEastAsia" w:hAnsi="Cambria Math"/>
                 </w:rPr>
                 <m:t>SNOW</m:t>
               </m:r>
               <m:r>
                 <w:rPr>
-                  <w:rFonts w:ascii="Cambria Math" w:hAnsi="Cambria Math"/>
+                  <w:rFonts w:ascii="Cambria Math" w:eastAsiaTheme="majorEastAsia" w:hAnsi="Cambria Math"/>
                 </w:rPr>
                 <m:t>,i</m:t>
               </m:r>
@@ -10380,188 +10972,61 @@
           </m:sSub>
           <m:r>
             <w:rPr>
-              <w:rFonts w:ascii="Cambria Math" w:hAnsi="Cambria Math"/>
+              <w:rFonts w:ascii="Cambria Math" w:eastAsiaTheme="majorEastAsia" w:hAnsi="Cambria Math"/>
             </w:rPr>
-            <m:t>=mA</m:t>
+            <m:t>=</m:t>
           </m:r>
-          <m:sSub>
-            <m:sSubPr>
+          <m:r>
+            <m:rPr>
+              <m:sty m:val="p"/>
+            </m:rPr>
+            <w:rPr>
+              <w:rFonts w:ascii="Cambria Math" w:eastAsiaTheme="majorEastAsia" w:hAnsi="Cambria Math"/>
+            </w:rPr>
+            <m:t>max</m:t>
+          </m:r>
+          <m:r>
+            <w:rPr>
+              <w:rFonts w:ascii="Cambria Math" w:eastAsiaTheme="majorEastAsia" w:hAnsi="Cambria Math"/>
+            </w:rPr>
+            <m:t>⁡</m:t>
+          </m:r>
+          <m:d>
+            <m:dPr>
+              <m:sepChr m:val=","/>
               <m:ctrlPr>
                 <w:rPr>
-                  <w:rFonts w:ascii="Cambria Math" w:hAnsi="Cambria Math"/>
+                  <w:rFonts w:ascii="Cambria Math" w:eastAsiaTheme="majorEastAsia" w:hAnsi="Cambria Math"/>
                 </w:rPr>
               </m:ctrlPr>
-            </m:sSubPr>
+            </m:dPr>
             <m:e>
               <m:r>
                 <w:rPr>
-                  <w:rFonts w:ascii="Cambria Math" w:hAnsi="Cambria Math"/>
+                  <w:rFonts w:ascii="Cambria Math" w:eastAsiaTheme="majorEastAsia" w:hAnsi="Cambria Math"/>
                 </w:rPr>
-                <m:t>P</m:t>
+                <m:t>0</m:t>
               </m:r>
             </m:e>
-            <m:sub>
-              <m:r>
-                <m:rPr>
-                  <m:sty m:val="p"/>
-                </m:rPr>
-                <w:rPr>
-                  <w:rFonts w:ascii="Cambria Math" w:hAnsi="Cambria Math"/>
-                </w:rPr>
-                <m:t>SNOW</m:t>
-              </m:r>
-              <m:r>
-                <w:rPr>
-                  <w:rFonts w:ascii="Cambria Math" w:hAnsi="Cambria Math"/>
-                </w:rPr>
-                <m:t>,</m:t>
-              </m:r>
-              <m:r>
-                <m:rPr>
-                  <m:sty m:val="p"/>
-                </m:rPr>
-                <w:rPr>
-                  <w:rFonts w:ascii="Cambria Math" w:hAnsi="Cambria Math"/>
-                </w:rPr>
-                <m:t>baseline</m:t>
-              </m:r>
-            </m:sub>
-          </m:sSub>
-          <m:r>
-            <w:rPr>
-              <w:rFonts w:ascii="Cambria Math" w:hAnsi="Cambria Math"/>
-            </w:rPr>
-            <m:t>-mA</m:t>
-          </m:r>
-          <m:sSub>
-            <m:sSubPr>
-              <m:ctrlPr>
-                <w:rPr>
-                  <w:rFonts w:ascii="Cambria Math" w:hAnsi="Cambria Math"/>
-                </w:rPr>
-              </m:ctrlPr>
-            </m:sSubPr>
             <m:e>
               <m:r>
                 <w:rPr>
-                  <w:rFonts w:ascii="Cambria Math" w:hAnsi="Cambria Math"/>
+                  <w:rFonts w:ascii="Cambria Math" w:eastAsiaTheme="majorEastAsia" w:hAnsi="Cambria Math"/>
                 </w:rPr>
-                <m:t>P</m:t>
-              </m:r>
-            </m:e>
-            <m:sub>
-              <m:r>
-                <m:rPr>
-                  <m:sty m:val="p"/>
-                </m:rPr>
-                <w:rPr>
-                  <w:rFonts w:ascii="Cambria Math" w:hAnsi="Cambria Math"/>
-                </w:rPr>
-                <m:t>SNOW</m:t>
-              </m:r>
-              <m:r>
-                <w:rPr>
-                  <w:rFonts w:ascii="Cambria Math" w:hAnsi="Cambria Math"/>
-                </w:rPr>
-                <m:t>,</m:t>
-              </m:r>
-              <m:r>
-                <m:rPr>
-                  <m:sty m:val="p"/>
-                </m:rPr>
-                <w:rPr>
-                  <w:rFonts w:ascii="Cambria Math" w:hAnsi="Cambria Math"/>
-                </w:rPr>
-                <m:t>pruned</m:t>
-              </m:r>
-              <m:r>
-                <w:rPr>
-                  <w:rFonts w:ascii="Cambria Math" w:hAnsi="Cambria Math"/>
-                </w:rPr>
-                <m:t>,i</m:t>
-              </m:r>
-            </m:sub>
-          </m:sSub>
-        </m:oMath>
-      </m:oMathPara>
-    </w:p>
-    <w:p>
-      <m:oMathPara>
-        <m:oMath>
-          <m:r>
-            <w:rPr>
-              <w:rFonts w:ascii="Cambria Math" w:hAnsi="Cambria Math"/>
-            </w:rPr>
-            <m:t>NA</m:t>
-          </m:r>
-          <m:sSub>
-            <m:sSubPr>
-              <m:ctrlPr>
-                <w:rPr>
-                  <w:rFonts w:ascii="Cambria Math" w:hAnsi="Cambria Math"/>
-                </w:rPr>
-              </m:ctrlPr>
-            </m:sSubPr>
-            <m:e>
-              <m:r>
-                <w:rPr>
-                  <w:rFonts w:ascii="Cambria Math" w:hAnsi="Cambria Math"/>
-                </w:rPr>
-                <m:t>D</m:t>
-              </m:r>
-            </m:e>
-            <m:sub>
-              <m:r>
-                <m:rPr>
-                  <m:sty m:val="p"/>
-                </m:rPr>
-                <w:rPr>
-                  <w:rFonts w:ascii="Cambria Math" w:hAnsi="Cambria Math"/>
-                </w:rPr>
-                <m:t>SNOW</m:t>
-              </m:r>
-              <m:r>
-                <w:rPr>
-                  <w:rFonts w:ascii="Cambria Math" w:hAnsi="Cambria Math"/>
-                </w:rPr>
-                <m:t>,i</m:t>
-              </m:r>
-            </m:sub>
-          </m:sSub>
-          <m:r>
-            <w:rPr>
-              <w:rFonts w:ascii="Cambria Math" w:hAnsi="Cambria Math"/>
-            </w:rPr>
-            <m:t>=</m:t>
-          </m:r>
-          <m:f>
-            <m:fPr>
-              <m:ctrlPr>
-                <w:rPr>
-                  <w:rFonts w:ascii="Cambria Math" w:hAnsi="Cambria Math"/>
-                  <w:i/>
-                </w:rPr>
-              </m:ctrlPr>
-            </m:fPr>
-            <m:num>
-              <m:r>
-                <w:rPr>
-                  <w:rFonts w:ascii="Cambria Math" w:hAnsi="Cambria Math"/>
-                </w:rPr>
-                <m:t>A</m:t>
+                <m:t>NA</m:t>
               </m:r>
               <m:sSub>
                 <m:sSubPr>
                   <m:ctrlPr>
                     <w:rPr>
-                      <w:rFonts w:ascii="Cambria Math" w:hAnsi="Cambria Math"/>
+                      <w:rFonts w:ascii="Cambria Math" w:eastAsiaTheme="majorEastAsia" w:hAnsi="Cambria Math"/>
                     </w:rPr>
                   </m:ctrlPr>
                 </m:sSubPr>
                 <m:e>
                   <m:r>
                     <w:rPr>
-                      <w:rFonts w:ascii="Cambria Math" w:hAnsi="Cambria Math"/>
+                      <w:rFonts w:ascii="Cambria Math" w:eastAsiaTheme="majorEastAsia" w:hAnsi="Cambria Math"/>
                     </w:rPr>
                     <m:t>D</m:t>
                   </m:r>
@@ -10572,40 +11037,138 @@
                       <m:sty m:val="p"/>
                     </m:rPr>
                     <w:rPr>
-                      <w:rFonts w:ascii="Cambria Math" w:hAnsi="Cambria Math"/>
+                      <w:rFonts w:ascii="Cambria Math" w:eastAsiaTheme="majorEastAsia" w:hAnsi="Cambria Math"/>
                     </w:rPr>
                     <m:t>SNOW</m:t>
                   </m:r>
                   <m:r>
                     <w:rPr>
-                      <w:rFonts w:ascii="Cambria Math" w:hAnsi="Cambria Math"/>
+                      <w:rFonts w:ascii="Cambria Math" w:eastAsiaTheme="majorEastAsia" w:hAnsi="Cambria Math"/>
                     </w:rPr>
                     <m:t>,i</m:t>
                   </m:r>
                 </m:sub>
               </m:sSub>
-            </m:num>
-            <m:den>
+            </m:e>
+          </m:d>
+        </m:oMath>
+      </m:oMathPara>
+    </w:p>
+    <w:p>
+      <w:pPr>
+        <w:rPr>
+          <w:rFonts w:eastAsiaTheme="majorEastAsia"/>
+        </w:rPr>
+      </w:pPr>
+    </w:p>
+    <w:p>
+      <w:pPr>
+        <w:rPr>
+          <w:rFonts w:eastAsiaTheme="majorEastAsia"/>
+          <w:b/>
+          <w:bCs/>
+        </w:rPr>
+      </w:pPr>
+      <w:r>
+        <w:rPr>
+          <w:rFonts w:eastAsiaTheme="majorEastAsia"/>
+          <w:b/>
+          <w:bCs/>
+        </w:rPr>
+        <w:t>Dual-Domain Sensitivity</w:t>
+      </w:r>
+    </w:p>
+    <w:p>
+      <w:pPr>
+        <w:rPr>
+          <w:rFonts w:eastAsiaTheme="majorEastAsia"/>
+        </w:rPr>
+      </w:pPr>
+      <w:r>
+        <w:rPr>
+          <w:rFonts w:eastAsiaTheme="majorEastAsia"/>
+        </w:rPr>
+        <w:t>The sensitivity score protects GEN accuracy while also including additional damage observed on the SNOW dataset.</w:t>
+      </w:r>
+    </w:p>
+    <w:p>
+      <w:pPr>
+        <w:rPr>
+          <w:rFonts w:eastAsiaTheme="majorEastAsia"/>
+        </w:rPr>
+      </w:pPr>
+      <m:oMathPara>
+        <m:oMath>
+          <m:sSub>
+            <m:sSubPr>
+              <m:ctrlPr>
+                <w:rPr>
+                  <w:rFonts w:ascii="Cambria Math" w:eastAsiaTheme="majorEastAsia" w:hAnsi="Cambria Math"/>
+                </w:rPr>
+              </m:ctrlPr>
+            </m:sSubPr>
+            <m:e>
               <m:r>
                 <w:rPr>
-                  <w:rFonts w:ascii="Cambria Math" w:hAnsi="Cambria Math"/>
+                  <w:rFonts w:ascii="Cambria Math" w:eastAsiaTheme="majorEastAsia" w:hAnsi="Cambria Math"/>
                 </w:rPr>
-                <m:t>mA</m:t>
+                <m:t>S</m:t>
               </m:r>
+            </m:e>
+            <m:sub>
+              <m:r>
+                <w:rPr>
+                  <w:rFonts w:ascii="Cambria Math" w:eastAsiaTheme="majorEastAsia" w:hAnsi="Cambria Math"/>
+                </w:rPr>
+                <m:t>i</m:t>
+              </m:r>
+            </m:sub>
+          </m:sSub>
+          <m:r>
+            <w:rPr>
+              <w:rFonts w:ascii="Cambria Math" w:eastAsiaTheme="majorEastAsia" w:hAnsi="Cambria Math"/>
+            </w:rPr>
+            <m:t>=</m:t>
+          </m:r>
+          <m:r>
+            <m:rPr>
+              <m:sty m:val="p"/>
+            </m:rPr>
+            <w:rPr>
+              <w:rFonts w:ascii="Cambria Math" w:eastAsiaTheme="majorEastAsia" w:hAnsi="Cambria Math"/>
+            </w:rPr>
+            <m:t>max</m:t>
+          </m:r>
+          <m:r>
+            <w:rPr>
+              <w:rFonts w:ascii="Cambria Math" w:eastAsiaTheme="majorEastAsia" w:hAnsi="Cambria Math"/>
+            </w:rPr>
+            <m:t>⁡</m:t>
+          </m:r>
+          <m:d>
+            <m:dPr>
+              <m:sepChr m:val=","/>
+              <m:ctrlPr>
+                <w:rPr>
+                  <w:rFonts w:ascii="Cambria Math" w:eastAsiaTheme="majorEastAsia" w:hAnsi="Cambria Math"/>
+                </w:rPr>
+              </m:ctrlPr>
+            </m:dPr>
+            <m:e>
               <m:sSub>
                 <m:sSubPr>
                   <m:ctrlPr>
                     <w:rPr>
-                      <w:rFonts w:ascii="Cambria Math" w:hAnsi="Cambria Math"/>
+                      <w:rFonts w:ascii="Cambria Math" w:eastAsiaTheme="majorEastAsia" w:hAnsi="Cambria Math"/>
                     </w:rPr>
                   </m:ctrlPr>
                 </m:sSubPr>
                 <m:e>
                   <m:r>
                     <w:rPr>
-                      <w:rFonts w:ascii="Cambria Math" w:hAnsi="Cambria Math"/>
+                      <w:rFonts w:ascii="Cambria Math" w:eastAsiaTheme="majorEastAsia" w:hAnsi="Cambria Math"/>
                     </w:rPr>
-                    <m:t>P</m:t>
+                    <m:t>h</m:t>
                   </m:r>
                 </m:e>
                 <m:sub>
@@ -10614,66 +11177,189 @@
                       <m:sty m:val="p"/>
                     </m:rPr>
                     <w:rPr>
-                      <w:rFonts w:ascii="Cambria Math" w:hAnsi="Cambria Math"/>
+                      <w:rFonts w:ascii="Cambria Math" w:eastAsiaTheme="majorEastAsia" w:hAnsi="Cambria Math"/>
                     </w:rPr>
-                    <m:t>SNOW</m:t>
+                    <m:t>GEN</m:t>
                   </m:r>
                   <m:r>
                     <w:rPr>
-                      <w:rFonts w:ascii="Cambria Math" w:hAnsi="Cambria Math"/>
+                      <w:rFonts w:ascii="Cambria Math" w:eastAsiaTheme="majorEastAsia" w:hAnsi="Cambria Math"/>
                     </w:rPr>
-                    <m:t>,</m:t>
-                  </m:r>
-                  <m:r>
-                    <m:rPr>
-                      <m:sty m:val="p"/>
-                    </m:rPr>
-                    <w:rPr>
-                      <w:rFonts w:ascii="Cambria Math" w:hAnsi="Cambria Math"/>
-                    </w:rPr>
-                    <m:t>baseline</m:t>
+                    <m:t>,i</m:t>
                   </m:r>
                 </m:sub>
               </m:sSub>
-            </m:den>
-          </m:f>
+            </m:e>
+            <m:e>
+              <m:r>
+                <w:rPr>
+                  <w:rFonts w:ascii="Cambria Math" w:eastAsiaTheme="majorEastAsia" w:hAnsi="Cambria Math"/>
+                </w:rPr>
+                <m:t xml:space="preserve"> </m:t>
+              </m:r>
+              <m:f>
+                <m:fPr>
+                  <m:ctrlPr>
+                    <w:rPr>
+                      <w:rFonts w:ascii="Cambria Math" w:eastAsiaTheme="majorEastAsia" w:hAnsi="Cambria Math"/>
+                    </w:rPr>
+                  </m:ctrlPr>
+                </m:fPr>
+                <m:num>
+                  <m:sSub>
+                    <m:sSubPr>
+                      <m:ctrlPr>
+                        <w:rPr>
+                          <w:rFonts w:ascii="Cambria Math" w:eastAsiaTheme="majorEastAsia" w:hAnsi="Cambria Math"/>
+                        </w:rPr>
+                      </m:ctrlPr>
+                    </m:sSubPr>
+                    <m:e>
+                      <m:r>
+                        <w:rPr>
+                          <w:rFonts w:ascii="Cambria Math" w:eastAsiaTheme="majorEastAsia" w:hAnsi="Cambria Math"/>
+                        </w:rPr>
+                        <m:t>h</m:t>
+                      </m:r>
+                    </m:e>
+                    <m:sub>
+                      <m:r>
+                        <m:rPr>
+                          <m:sty m:val="p"/>
+                        </m:rPr>
+                        <w:rPr>
+                          <w:rFonts w:ascii="Cambria Math" w:eastAsiaTheme="majorEastAsia" w:hAnsi="Cambria Math"/>
+                        </w:rPr>
+                        <m:t>GEN</m:t>
+                      </m:r>
+                      <m:r>
+                        <w:rPr>
+                          <w:rFonts w:ascii="Cambria Math" w:eastAsiaTheme="majorEastAsia" w:hAnsi="Cambria Math"/>
+                        </w:rPr>
+                        <m:t>,i</m:t>
+                      </m:r>
+                    </m:sub>
+                  </m:sSub>
+                  <m:r>
+                    <w:rPr>
+                      <w:rFonts w:ascii="Cambria Math" w:eastAsiaTheme="majorEastAsia" w:hAnsi="Cambria Math"/>
+                    </w:rPr>
+                    <m:t>+</m:t>
+                  </m:r>
+                  <m:sSub>
+                    <m:sSubPr>
+                      <m:ctrlPr>
+                        <w:rPr>
+                          <w:rFonts w:ascii="Cambria Math" w:eastAsiaTheme="majorEastAsia" w:hAnsi="Cambria Math"/>
+                        </w:rPr>
+                      </m:ctrlPr>
+                    </m:sSubPr>
+                    <m:e>
+                      <m:r>
+                        <w:rPr>
+                          <w:rFonts w:ascii="Cambria Math" w:eastAsiaTheme="majorEastAsia" w:hAnsi="Cambria Math"/>
+                        </w:rPr>
+                        <m:t>h</m:t>
+                      </m:r>
+                    </m:e>
+                    <m:sub>
+                      <m:r>
+                        <m:rPr>
+                          <m:sty m:val="p"/>
+                        </m:rPr>
+                        <w:rPr>
+                          <w:rFonts w:ascii="Cambria Math" w:eastAsiaTheme="majorEastAsia" w:hAnsi="Cambria Math"/>
+                        </w:rPr>
+                        <m:t>SNOW</m:t>
+                      </m:r>
+                      <m:r>
+                        <w:rPr>
+                          <w:rFonts w:ascii="Cambria Math" w:eastAsiaTheme="majorEastAsia" w:hAnsi="Cambria Math"/>
+                        </w:rPr>
+                        <m:t>,i</m:t>
+                      </m:r>
+                    </m:sub>
+                  </m:sSub>
+                </m:num>
+                <m:den>
+                  <m:r>
+                    <w:rPr>
+                      <w:rFonts w:ascii="Cambria Math" w:eastAsiaTheme="majorEastAsia" w:hAnsi="Cambria Math"/>
+                    </w:rPr>
+                    <m:t>2</m:t>
+                  </m:r>
+                </m:den>
+              </m:f>
+            </m:e>
+          </m:d>
         </m:oMath>
       </m:oMathPara>
     </w:p>
     <w:p>
-      <w:r>
-        <w:t xml:space="preserve">The sensitivity of layer </w:t>
-      </w:r>
-      <w:r>
-        <w:t xml:space="preserve">i </w:t>
-      </w:r>
-      <w:r>
-        <w:t>is defined as:</w:t>
-      </w:r>
-    </w:p>
-    <w:p>
+      <w:pPr>
+        <w:rPr>
+          <w:rFonts w:eastAsiaTheme="majorEastAsia"/>
+        </w:rPr>
+      </w:pPr>
+    </w:p>
+    <w:p>
+      <w:pPr>
+        <w:rPr>
+          <w:rFonts w:eastAsiaTheme="majorEastAsia"/>
+          <w:b/>
+          <w:bCs/>
+        </w:rPr>
+      </w:pPr>
+      <w:r>
+        <w:rPr>
+          <w:rFonts w:eastAsiaTheme="majorEastAsia"/>
+          <w:b/>
+          <w:bCs/>
+        </w:rPr>
+        <w:t>Resource Benefit</w:t>
+      </w:r>
+    </w:p>
+    <w:p>
+      <w:pPr>
+        <w:rPr>
+          <w:rFonts w:eastAsiaTheme="majorEastAsia"/>
+        </w:rPr>
+      </w:pPr>
+      <w:r>
+        <w:rPr>
+          <w:rFonts w:eastAsiaTheme="majorEastAsia"/>
+        </w:rPr>
+        <w:t>The resource benefit gives equal importance to normalized parameter reduction and normalized GFLOP reduction.</w:t>
+      </w:r>
+    </w:p>
+    <w:p>
+      <w:pPr>
+        <w:rPr>
+          <w:rFonts w:eastAsiaTheme="majorEastAsia"/>
+        </w:rPr>
+      </w:pPr>
       <m:oMathPara>
         <m:oMath>
           <m:sSub>
             <m:sSubPr>
               <m:ctrlPr>
                 <w:rPr>
-                  <w:rFonts w:ascii="Cambria Math" w:hAnsi="Cambria Math"/>
+                  <w:rFonts w:ascii="Cambria Math" w:eastAsiaTheme="majorEastAsia" w:hAnsi="Cambria Math"/>
                 </w:rPr>
               </m:ctrlPr>
             </m:sSubPr>
             <m:e>
               <m:r>
                 <w:rPr>
-                  <w:rFonts w:ascii="Cambria Math" w:hAnsi="Cambria Math"/>
+                  <w:rFonts w:ascii="Cambria Math" w:eastAsiaTheme="majorEastAsia" w:hAnsi="Cambria Math"/>
                 </w:rPr>
-                <m:t>S</m:t>
+                <m:t>B</m:t>
               </m:r>
             </m:e>
             <m:sub>
               <m:r>
                 <w:rPr>
-                  <w:rFonts w:ascii="Cambria Math" w:hAnsi="Cambria Math"/>
+                  <w:rFonts w:ascii="Cambria Math" w:eastAsiaTheme="majorEastAsia" w:hAnsi="Cambria Math"/>
                 </w:rPr>
                 <m:t>i</m:t>
               </m:r>
@@ -10681,24 +11367,24 @@
           </m:sSub>
           <m:r>
             <w:rPr>
-              <w:rFonts w:ascii="Cambria Math" w:hAnsi="Cambria Math"/>
+              <w:rFonts w:ascii="Cambria Math" w:eastAsiaTheme="majorEastAsia" w:hAnsi="Cambria Math"/>
             </w:rPr>
-            <m:t>=NA</m:t>
+            <m:t>=0.5×</m:t>
           </m:r>
           <m:sSub>
             <m:sSubPr>
               <m:ctrlPr>
                 <w:rPr>
-                  <w:rFonts w:ascii="Cambria Math" w:hAnsi="Cambria Math"/>
+                  <w:rFonts w:ascii="Cambria Math" w:eastAsiaTheme="majorEastAsia" w:hAnsi="Cambria Math"/>
                 </w:rPr>
               </m:ctrlPr>
             </m:sSubPr>
             <m:e>
               <m:r>
                 <w:rPr>
-                  <w:rFonts w:ascii="Cambria Math" w:hAnsi="Cambria Math"/>
+                  <w:rFonts w:ascii="Cambria Math" w:eastAsiaTheme="majorEastAsia" w:hAnsi="Cambria Math"/>
                 </w:rPr>
-                <m:t>D</m:t>
+                <m:t>R</m:t>
               </m:r>
             </m:e>
             <m:sub>
@@ -10707,13 +11393,13 @@
                   <m:sty m:val="p"/>
                 </m:rPr>
                 <w:rPr>
-                  <w:rFonts w:ascii="Cambria Math" w:hAnsi="Cambria Math"/>
+                  <w:rFonts w:ascii="Cambria Math" w:eastAsiaTheme="majorEastAsia" w:hAnsi="Cambria Math"/>
                 </w:rPr>
-                <m:t>GEN</m:t>
+                <m:t>Parameters</m:t>
               </m:r>
               <m:r>
                 <w:rPr>
-                  <w:rFonts w:ascii="Cambria Math" w:hAnsi="Cambria Math"/>
+                  <w:rFonts w:ascii="Cambria Math" w:eastAsiaTheme="majorEastAsia" w:hAnsi="Cambria Math"/>
                 </w:rPr>
                 <m:t>,i</m:t>
               </m:r>
@@ -10721,24 +11407,24 @@
           </m:sSub>
           <m:r>
             <w:rPr>
-              <w:rFonts w:ascii="Cambria Math" w:hAnsi="Cambria Math"/>
+              <w:rFonts w:ascii="Cambria Math" w:eastAsiaTheme="majorEastAsia" w:hAnsi="Cambria Math"/>
             </w:rPr>
-            <m:t>-NA</m:t>
+            <m:t>+0.5×</m:t>
           </m:r>
           <m:sSub>
             <m:sSubPr>
               <m:ctrlPr>
                 <w:rPr>
-                  <w:rFonts w:ascii="Cambria Math" w:hAnsi="Cambria Math"/>
+                  <w:rFonts w:ascii="Cambria Math" w:eastAsiaTheme="majorEastAsia" w:hAnsi="Cambria Math"/>
                 </w:rPr>
               </m:ctrlPr>
             </m:sSubPr>
             <m:e>
               <m:r>
                 <w:rPr>
-                  <w:rFonts w:ascii="Cambria Math" w:hAnsi="Cambria Math"/>
+                  <w:rFonts w:ascii="Cambria Math" w:eastAsiaTheme="majorEastAsia" w:hAnsi="Cambria Math"/>
                 </w:rPr>
-                <m:t>D</m:t>
+                <m:t>R</m:t>
               </m:r>
             </m:e>
             <m:sub>
@@ -10747,13 +11433,13 @@
                   <m:sty m:val="p"/>
                 </m:rPr>
                 <w:rPr>
-                  <w:rFonts w:ascii="Cambria Math" w:hAnsi="Cambria Math"/>
+                  <w:rFonts w:ascii="Cambria Math" w:eastAsiaTheme="majorEastAsia" w:hAnsi="Cambria Math"/>
                 </w:rPr>
-                <m:t>SNOW</m:t>
+                <m:t>GFLOPs</m:t>
               </m:r>
               <m:r>
                 <w:rPr>
-                  <w:rFonts w:ascii="Cambria Math" w:hAnsi="Cambria Math"/>
+                  <w:rFonts w:ascii="Cambria Math" w:eastAsiaTheme="majorEastAsia" w:hAnsi="Cambria Math"/>
                 </w:rPr>
                 <m:t>,i</m:t>
               </m:r>
@@ -10762,44 +11448,96 @@
         </m:oMath>
       </m:oMathPara>
     </w:p>
-    <w:p/>
-    <w:p>
-      <w:r>
-        <w:t xml:space="preserve">The parameter percentage of layer </w:t>
-      </w:r>
-      <w:r>
-        <w:t xml:space="preserve">i </w:t>
-      </w:r>
-      <w:r>
-        <w:t>is calculated as:</w:t>
-      </w:r>
-    </w:p>
-    <w:p>
+    <w:p>
+      <w:pPr>
+        <w:rPr>
+          <w:rFonts w:eastAsiaTheme="majorEastAsia"/>
+        </w:rPr>
+      </w:pPr>
+    </w:p>
+    <w:p>
+      <w:pPr>
+        <w:rPr>
+          <w:rFonts w:eastAsiaTheme="majorEastAsia"/>
+          <w:b/>
+          <w:bCs/>
+        </w:rPr>
+      </w:pPr>
+      <w:proofErr w:type="spellStart"/>
+      <w:r>
+        <w:rPr>
+          <w:rFonts w:eastAsiaTheme="majorEastAsia"/>
+          <w:b/>
+          <w:bCs/>
+        </w:rPr>
+        <w:lastRenderedPageBreak/>
+        <w:t>Prunability</w:t>
+      </w:r>
+      <w:proofErr w:type="spellEnd"/>
+      <w:r>
+        <w:rPr>
+          <w:rFonts w:eastAsiaTheme="majorEastAsia"/>
+          <w:b/>
+          <w:bCs/>
+        </w:rPr>
+        <w:t xml:space="preserve"> Score</w:t>
+      </w:r>
+    </w:p>
+    <w:p>
+      <w:pPr>
+        <w:rPr>
+          <w:rFonts w:eastAsiaTheme="majorEastAsia"/>
+        </w:rPr>
+      </w:pPr>
+      <w:r>
+        <w:rPr>
+          <w:rFonts w:eastAsiaTheme="majorEastAsia"/>
+        </w:rPr>
+        <w:t xml:space="preserve">The </w:t>
+      </w:r>
+      <w:proofErr w:type="spellStart"/>
+      <w:r>
+        <w:rPr>
+          <w:rFonts w:eastAsiaTheme="majorEastAsia"/>
+        </w:rPr>
+        <w:t>prunability</w:t>
+      </w:r>
+      <w:proofErr w:type="spellEnd"/>
+      <w:r>
+        <w:rPr>
+          <w:rFonts w:eastAsiaTheme="majorEastAsia"/>
+        </w:rPr>
+        <w:t xml:space="preserve"> score rewards useful resource reduction while strongly penalizing groups that cause accuracy loss.</w:t>
+      </w:r>
+    </w:p>
+    <w:p>
+      <w:pPr>
+        <w:rPr>
+          <w:rFonts w:eastAsiaTheme="majorEastAsia"/>
+        </w:rPr>
+      </w:pPr>
       <m:oMathPara>
         <m:oMath>
           <m:sSub>
             <m:sSubPr>
               <m:ctrlPr>
                 <w:rPr>
-                  <w:rFonts w:ascii="Cambria Math" w:hAnsi="Cambria Math"/>
+                  <w:rFonts w:ascii="Cambria Math" w:eastAsiaTheme="majorEastAsia" w:hAnsi="Cambria Math"/>
                 </w:rPr>
               </m:ctrlPr>
             </m:sSubPr>
             <m:e>
               <m:r>
-                <m:rPr>
-                  <m:sty m:val="p"/>
-                </m:rPr>
                 <w:rPr>
-                  <w:rFonts w:ascii="Cambria Math" w:hAnsi="Cambria Math"/>
+                  <w:rFonts w:ascii="Cambria Math" w:eastAsiaTheme="majorEastAsia" w:hAnsi="Cambria Math"/>
                 </w:rPr>
-                <m:t>Parameters%</m:t>
+                <m:t>P</m:t>
               </m:r>
             </m:e>
             <m:sub>
               <m:r>
                 <w:rPr>
-                  <w:rFonts w:ascii="Cambria Math" w:hAnsi="Cambria Math"/>
+                  <w:rFonts w:ascii="Cambria Math" w:eastAsiaTheme="majorEastAsia" w:hAnsi="Cambria Math"/>
                 </w:rPr>
                 <m:t>i</m:t>
               </m:r>
@@ -10807,7 +11545,7 @@
           </m:sSub>
           <m:r>
             <w:rPr>
-              <w:rFonts w:ascii="Cambria Math" w:hAnsi="Cambria Math"/>
+              <w:rFonts w:ascii="Cambria Math" w:eastAsiaTheme="majorEastAsia" w:hAnsi="Cambria Math"/>
             </w:rPr>
             <m:t>=</m:t>
           </m:r>
@@ -10815,274 +11553,224 @@
             <m:fPr>
               <m:ctrlPr>
                 <w:rPr>
-                  <w:rFonts w:ascii="Cambria Math" w:hAnsi="Cambria Math"/>
+                  <w:rFonts w:ascii="Cambria Math" w:eastAsiaTheme="majorEastAsia" w:hAnsi="Cambria Math"/>
                 </w:rPr>
               </m:ctrlPr>
             </m:fPr>
             <m:num>
-              <m:sSub>
-                <m:sSubPr>
+              <m:rad>
+                <m:radPr>
+                  <m:degHide m:val="1"/>
                   <m:ctrlPr>
                     <w:rPr>
-                      <w:rFonts w:ascii="Cambria Math" w:hAnsi="Cambria Math"/>
+                      <w:rFonts w:ascii="Cambria Math" w:eastAsiaTheme="majorEastAsia" w:hAnsi="Cambria Math"/>
                     </w:rPr>
                   </m:ctrlPr>
-                </m:sSubPr>
+                </m:radPr>
+                <m:deg/>
                 <m:e>
-                  <m:r>
-                    <m:rPr>
-                      <m:sty m:val="p"/>
-                    </m:rPr>
-                    <w:rPr>
-                      <w:rFonts w:ascii="Cambria Math" w:hAnsi="Cambria Math"/>
-                    </w:rPr>
-                    <m:t>Parameters</m:t>
-                  </m:r>
+                  <m:sSub>
+                    <m:sSubPr>
+                      <m:ctrlPr>
+                        <w:rPr>
+                          <w:rFonts w:ascii="Cambria Math" w:eastAsiaTheme="majorEastAsia" w:hAnsi="Cambria Math"/>
+                        </w:rPr>
+                      </m:ctrlPr>
+                    </m:sSubPr>
+                    <m:e>
+                      <m:r>
+                        <w:rPr>
+                          <w:rFonts w:ascii="Cambria Math" w:eastAsiaTheme="majorEastAsia" w:hAnsi="Cambria Math"/>
+                        </w:rPr>
+                        <m:t>B</m:t>
+                      </m:r>
+                    </m:e>
+                    <m:sub>
+                      <m:r>
+                        <w:rPr>
+                          <w:rFonts w:ascii="Cambria Math" w:eastAsiaTheme="majorEastAsia" w:hAnsi="Cambria Math"/>
+                        </w:rPr>
+                        <m:t>i</m:t>
+                      </m:r>
+                    </m:sub>
+                  </m:sSub>
                 </m:e>
-                <m:sub>
-                  <m:r>
-                    <w:rPr>
-                      <w:rFonts w:ascii="Cambria Math" w:hAnsi="Cambria Math"/>
-                    </w:rPr>
-                    <m:t>i</m:t>
-                  </m:r>
-                </m:sub>
-              </m:sSub>
+              </m:rad>
             </m:num>
             <m:den>
               <m:r>
-                <m:rPr>
-                  <m:sty m:val="p"/>
-                </m:rPr>
                 <w:rPr>
-                  <w:rFonts w:ascii="Cambria Math" w:hAnsi="Cambria Math"/>
+                  <w:rFonts w:ascii="Cambria Math" w:eastAsiaTheme="majorEastAsia" w:hAnsi="Cambria Math"/>
                 </w:rPr>
-                <m:t>Total Model Parameters</m:t>
+                <m:t>1+</m:t>
               </m:r>
+              <m:sSup>
+                <m:sSupPr>
+                  <m:ctrlPr>
+                    <w:rPr>
+                      <w:rFonts w:ascii="Cambria Math" w:eastAsiaTheme="majorEastAsia" w:hAnsi="Cambria Math"/>
+                    </w:rPr>
+                  </m:ctrlPr>
+                </m:sSupPr>
+                <m:e>
+                  <m:d>
+                    <m:dPr>
+                      <m:ctrlPr>
+                        <w:rPr>
+                          <w:rFonts w:ascii="Cambria Math" w:eastAsiaTheme="majorEastAsia" w:hAnsi="Cambria Math"/>
+                        </w:rPr>
+                      </m:ctrlPr>
+                    </m:dPr>
+                    <m:e>
+                      <m:f>
+                        <m:fPr>
+                          <m:ctrlPr>
+                            <w:rPr>
+                              <w:rFonts w:ascii="Cambria Math" w:eastAsiaTheme="majorEastAsia" w:hAnsi="Cambria Math"/>
+                            </w:rPr>
+                          </m:ctrlPr>
+                        </m:fPr>
+                        <m:num>
+                          <m:sSub>
+                            <m:sSubPr>
+                              <m:ctrlPr>
+                                <w:rPr>
+                                  <w:rFonts w:ascii="Cambria Math" w:eastAsiaTheme="majorEastAsia" w:hAnsi="Cambria Math"/>
+                                </w:rPr>
+                              </m:ctrlPr>
+                            </m:sSubPr>
+                            <m:e>
+                              <m:r>
+                                <w:rPr>
+                                  <w:rFonts w:ascii="Cambria Math" w:eastAsiaTheme="majorEastAsia" w:hAnsi="Cambria Math"/>
+                                </w:rPr>
+                                <m:t>S</m:t>
+                              </m:r>
+                            </m:e>
+                            <m:sub>
+                              <m:r>
+                                <w:rPr>
+                                  <w:rFonts w:ascii="Cambria Math" w:eastAsiaTheme="majorEastAsia" w:hAnsi="Cambria Math"/>
+                                </w:rPr>
+                                <m:t>i</m:t>
+                              </m:r>
+                            </m:sub>
+                          </m:sSub>
+                        </m:num>
+                        <m:den>
+                          <m:r>
+                            <w:rPr>
+                              <w:rFonts w:ascii="Cambria Math" w:eastAsiaTheme="majorEastAsia" w:hAnsi="Cambria Math"/>
+                            </w:rPr>
+                            <m:t>τ</m:t>
+                          </m:r>
+                        </m:den>
+                      </m:f>
+                    </m:e>
+                  </m:d>
+                </m:e>
+                <m:sup>
+                  <m:r>
+                    <w:rPr>
+                      <w:rFonts w:ascii="Cambria Math" w:eastAsiaTheme="majorEastAsia" w:hAnsi="Cambria Math"/>
+                    </w:rPr>
+                    <m:t>2</m:t>
+                  </m:r>
+                </m:sup>
+              </m:sSup>
             </m:den>
           </m:f>
           <m:r>
             <w:rPr>
-              <w:rFonts w:ascii="Cambria Math" w:hAnsi="Cambria Math"/>
+              <w:rFonts w:ascii="Cambria Math" w:eastAsiaTheme="majorEastAsia" w:hAnsi="Cambria Math"/>
             </w:rPr>
-            <m:t>×100</m:t>
+            <m:t xml:space="preserve"> </m:t>
+          </m:r>
+          <m:r>
+            <m:rPr>
+              <m:nor/>
+            </m:rPr>
+            <w:rPr>
+              <w:rFonts w:ascii="Cambria Math" w:eastAsiaTheme="majorEastAsia"/>
+            </w:rPr>
+            <m:t>,</m:t>
+          </m:r>
+          <m:r>
+            <m:rPr>
+              <m:nor/>
+            </m:rPr>
+            <w:rPr>
+              <w:rFonts w:eastAsiaTheme="majorEastAsia"/>
+            </w:rPr>
+            <m:t> </m:t>
+          </m:r>
+          <m:r>
+            <w:rPr>
+              <w:rFonts w:ascii="Cambria Math" w:eastAsiaTheme="majorEastAsia" w:hAnsi="Cambria Math"/>
+            </w:rPr>
+            <m:t>τ=0.05</m:t>
+          </m:r>
+          <m:r>
+            <w:rPr>
+              <w:rFonts w:eastAsiaTheme="majorEastAsia"/>
+            </w:rPr>
+            <w:br/>
           </m:r>
         </m:oMath>
       </m:oMathPara>
     </w:p>
-    <w:p/>
-    <w:p>
-      <w:r>
-        <w:t xml:space="preserve">The Prunability score of layers </w:t>
-      </w:r>
-      <w:r>
-        <w:t xml:space="preserve">i </w:t>
-      </w:r>
-      <w:r>
-        <w:t>is defined as:</w:t>
-      </w:r>
-    </w:p>
-    <w:p>
+    <w:p>
+      <w:pPr>
+        <w:rPr>
+          <w:rFonts w:eastAsiaTheme="majorEastAsia"/>
+          <w:b/>
+          <w:bCs/>
+        </w:rPr>
+      </w:pPr>
+      <w:r>
+        <w:rPr>
+          <w:rFonts w:eastAsiaTheme="majorEastAsia"/>
+          <w:b/>
+          <w:bCs/>
+        </w:rPr>
+        <w:t>Initial Screening Gate</w:t>
+      </w:r>
+    </w:p>
+    <w:p>
+      <w:pPr>
+        <w:rPr>
+          <w:rFonts w:eastAsiaTheme="majorEastAsia"/>
+        </w:rPr>
+      </w:pPr>
+      <w:r>
+        <w:rPr>
+          <w:rFonts w:eastAsiaTheme="majorEastAsia"/>
+        </w:rPr>
+        <w:t>A pruning group is accepted only when its normalized loss is no greater than 5% on both datasets.</w:t>
+      </w:r>
+    </w:p>
+    <w:p>
+      <w:pPr>
+        <w:rPr>
+          <w:rFonts w:eastAsiaTheme="majorEastAsia"/>
+        </w:rPr>
+      </w:pPr>
       <m:oMathPara>
         <m:oMath>
           <m:sSub>
             <m:sSubPr>
               <m:ctrlPr>
                 <w:rPr>
-                  <w:rFonts w:ascii="Cambria Math" w:hAnsi="Cambria Math"/>
+                  <w:rFonts w:ascii="Cambria Math" w:eastAsiaTheme="majorEastAsia" w:hAnsi="Cambria Math"/>
                 </w:rPr>
               </m:ctrlPr>
             </m:sSubPr>
             <m:e>
               <m:r>
                 <w:rPr>
-                  <w:rFonts w:ascii="Cambria Math" w:hAnsi="Cambria Math"/>
+                  <w:rFonts w:ascii="Cambria Math" w:eastAsiaTheme="majorEastAsia" w:hAnsi="Cambria Math"/>
                 </w:rPr>
-                <m:t>P</m:t>
-              </m:r>
-            </m:e>
-            <m:sub>
-              <m:r>
-                <w:rPr>
-                  <w:rFonts w:ascii="Cambria Math" w:hAnsi="Cambria Math"/>
-                </w:rPr>
-                <m:t>i</m:t>
-              </m:r>
-            </m:sub>
-          </m:sSub>
-          <m:r>
-            <w:rPr>
-              <w:rFonts w:ascii="Cambria Math" w:hAnsi="Cambria Math"/>
-            </w:rPr>
-            <m:t>=</m:t>
-          </m:r>
-          <m:f>
-            <m:fPr>
-              <m:ctrlPr>
-                <w:rPr>
-                  <w:rFonts w:ascii="Cambria Math" w:hAnsi="Cambria Math"/>
-                </w:rPr>
-              </m:ctrlPr>
-            </m:fPr>
-            <m:num>
-              <m:sSub>
-                <m:sSubPr>
-                  <m:ctrlPr>
-                    <w:rPr>
-                      <w:rFonts w:ascii="Cambria Math" w:hAnsi="Cambria Math"/>
-                    </w:rPr>
-                  </m:ctrlPr>
-                </m:sSubPr>
-                <m:e>
-                  <m:r>
-                    <m:rPr>
-                      <m:sty m:val="p"/>
-                    </m:rPr>
-                    <w:rPr>
-                      <w:rFonts w:ascii="Cambria Math" w:hAnsi="Cambria Math"/>
-                    </w:rPr>
-                    <m:t>Parameters%</m:t>
-                  </m:r>
-                </m:e>
-                <m:sub>
-                  <m:r>
-                    <w:rPr>
-                      <w:rFonts w:ascii="Cambria Math" w:hAnsi="Cambria Math"/>
-                    </w:rPr>
-                    <m:t>i</m:t>
-                  </m:r>
-                </m:sub>
-              </m:sSub>
-            </m:num>
-            <m:den>
-              <m:sSub>
-                <m:sSubPr>
-                  <m:ctrlPr>
-                    <w:rPr>
-                      <w:rFonts w:ascii="Cambria Math" w:hAnsi="Cambria Math"/>
-                    </w:rPr>
-                  </m:ctrlPr>
-                </m:sSubPr>
-                <m:e>
-                  <m:r>
-                    <w:rPr>
-                      <w:rFonts w:ascii="Cambria Math" w:hAnsi="Cambria Math"/>
-                    </w:rPr>
-                    <m:t>S</m:t>
-                  </m:r>
-                </m:e>
-                <m:sub>
-                  <m:r>
-                    <w:rPr>
-                      <w:rFonts w:ascii="Cambria Math" w:hAnsi="Cambria Math"/>
-                    </w:rPr>
-                    <m:t>i</m:t>
-                  </m:r>
-                </m:sub>
-              </m:sSub>
-            </m:den>
-          </m:f>
-        </m:oMath>
-      </m:oMathPara>
-    </w:p>
-    <w:p>
-      <w:pPr>
-        <w:rPr>
-          <w:b/>
-          <w:bCs/>
-        </w:rPr>
-      </w:pPr>
-      <w:r>
-        <w:rPr>
-          <w:b/>
-          <w:bCs/>
-        </w:rPr>
-        <w:br w:type="page"/>
-      </w:r>
-    </w:p>
-    <w:p>
-      <w:pPr>
-        <w:rPr>
-          <w:b/>
-          <w:bCs/>
-          <w:sz w:val="28"/>
-          <w:szCs w:val="24"/>
-        </w:rPr>
-      </w:pPr>
-      <w:r>
-        <w:rPr>
-          <w:b/>
-          <w:bCs/>
-          <w:sz w:val="28"/>
-          <w:szCs w:val="24"/>
-        </w:rPr>
-        <w:lastRenderedPageBreak/>
-        <w:t>3</w:t>
-      </w:r>
-      <w:r>
-        <w:rPr>
-          <w:b/>
-          <w:bCs/>
-          <w:sz w:val="28"/>
-          <w:szCs w:val="24"/>
-        </w:rPr>
-        <w:t>.</w:t>
-      </w:r>
-      <w:r>
-        <w:rPr>
-          <w:b/>
-          <w:bCs/>
-          <w:sz w:val="28"/>
-          <w:szCs w:val="24"/>
-        </w:rPr>
-        <w:t>2</w:t>
-      </w:r>
-      <w:r>
-        <w:rPr>
-          <w:b/>
-          <w:bCs/>
-          <w:sz w:val="28"/>
-          <w:szCs w:val="24"/>
-        </w:rPr>
-        <w:t>.1 example</w:t>
-      </w:r>
-    </w:p>
-    <w:p>
-      <w:r>
-        <w:t>Given</w:t>
-      </w:r>
-      <w:r>
-        <w:t>:</w:t>
-      </w:r>
-    </w:p>
-    <w:p>
-      <w:pPr>
-        <w:rPr>
-          <w:i/>
-        </w:rPr>
-      </w:pPr>
-      <m:oMathPara>
-        <m:oMath>
-          <m:r>
-            <w:rPr>
-              <w:rFonts w:ascii="Cambria Math" w:hAnsi="Cambria Math"/>
-            </w:rPr>
-            <m:t>mA</m:t>
-          </m:r>
-          <m:sSub>
-            <m:sSubPr>
-              <m:ctrlPr>
-                <w:rPr>
-                  <w:rFonts w:ascii="Cambria Math" w:hAnsi="Cambria Math"/>
-                </w:rPr>
-              </m:ctrlPr>
-            </m:sSubPr>
-            <m:e>
-              <m:r>
-                <w:rPr>
-                  <w:rFonts w:ascii="Cambria Math" w:hAnsi="Cambria Math"/>
-                </w:rPr>
-                <m:t>P</m:t>
+                <m:t>h</m:t>
               </m:r>
             </m:e>
             <m:sub>
@@ -11091,64 +11779,56 @@
                   <m:sty m:val="p"/>
                 </m:rPr>
                 <w:rPr>
-                  <w:rFonts w:ascii="Cambria Math" w:hAnsi="Cambria Math"/>
+                  <w:rFonts w:ascii="Cambria Math" w:eastAsiaTheme="majorEastAsia" w:hAnsi="Cambria Math"/>
                 </w:rPr>
                 <m:t>GEN</m:t>
               </m:r>
               <m:r>
                 <w:rPr>
-                  <w:rFonts w:ascii="Cambria Math" w:hAnsi="Cambria Math"/>
+                  <w:rFonts w:ascii="Cambria Math" w:eastAsiaTheme="majorEastAsia" w:hAnsi="Cambria Math"/>
                 </w:rPr>
-                <m:t>,</m:t>
-              </m:r>
-              <m:r>
-                <m:rPr>
-                  <m:sty m:val="p"/>
-                </m:rPr>
-                <w:rPr>
-                  <w:rFonts w:ascii="Cambria Math" w:hAnsi="Cambria Math"/>
-                </w:rPr>
-                <m:t>baseline</m:t>
+                <m:t>,i</m:t>
               </m:r>
             </m:sub>
           </m:sSub>
           <m:r>
             <w:rPr>
-              <w:rFonts w:ascii="Cambria Math" w:hAnsi="Cambria Math"/>
+              <w:rFonts w:ascii="Cambria Math" w:eastAsiaTheme="majorEastAsia" w:hAnsi="Cambria Math"/>
             </w:rPr>
-            <m:t>=0.50</m:t>
+            <m:t xml:space="preserve">≤0.05 </m:t>
           </m:r>
-        </m:oMath>
-      </m:oMathPara>
-    </w:p>
-    <w:p>
-      <w:pPr>
-        <w:rPr>
-          <w:i/>
-        </w:rPr>
-      </w:pPr>
-      <m:oMathPara>
-        <m:oMath>
           <m:r>
+            <m:rPr>
+              <m:nor/>
+            </m:rPr>
             <w:rPr>
-              <w:rFonts w:ascii="Cambria Math" w:hAnsi="Cambria Math"/>
+              <w:rFonts w:eastAsiaTheme="majorEastAsia"/>
             </w:rPr>
-            <m:t>mA</m:t>
+            <m:t>and</m:t>
+          </m:r>
+          <m:r>
+            <m:rPr>
+              <m:nor/>
+            </m:rPr>
+            <w:rPr>
+              <w:rFonts w:ascii="Cambria Math" w:eastAsiaTheme="majorEastAsia"/>
+            </w:rPr>
+            <m:t xml:space="preserve"> </m:t>
           </m:r>
           <m:sSub>
             <m:sSubPr>
               <m:ctrlPr>
                 <w:rPr>
-                  <w:rFonts w:ascii="Cambria Math" w:hAnsi="Cambria Math"/>
+                  <w:rFonts w:ascii="Cambria Math" w:eastAsiaTheme="majorEastAsia" w:hAnsi="Cambria Math"/>
                 </w:rPr>
               </m:ctrlPr>
             </m:sSubPr>
             <m:e>
               <m:r>
                 <w:rPr>
-                  <w:rFonts w:ascii="Cambria Math" w:hAnsi="Cambria Math"/>
+                  <w:rFonts w:ascii="Cambria Math" w:eastAsiaTheme="majorEastAsia" w:hAnsi="Cambria Math"/>
                 </w:rPr>
-                <m:t>P</m:t>
+                <m:t>h</m:t>
               </m:r>
             </m:e>
             <m:sub>
@@ -11157,28 +11837,13 @@
                   <m:sty m:val="p"/>
                 </m:rPr>
                 <w:rPr>
-                  <w:rFonts w:ascii="Cambria Math" w:hAnsi="Cambria Math"/>
+                  <w:rFonts w:ascii="Cambria Math" w:eastAsiaTheme="majorEastAsia" w:hAnsi="Cambria Math"/>
                 </w:rPr>
-                <m:t>GEN</m:t>
+                <m:t>SNOW</m:t>
               </m:r>
               <m:r>
                 <w:rPr>
-                  <w:rFonts w:ascii="Cambria Math" w:hAnsi="Cambria Math"/>
-                </w:rPr>
-                <m:t>,</m:t>
-              </m:r>
-              <m:r>
-                <m:rPr>
-                  <m:sty m:val="p"/>
-                </m:rPr>
-                <w:rPr>
-                  <w:rFonts w:ascii="Cambria Math" w:hAnsi="Cambria Math"/>
-                </w:rPr>
-                <m:t>pruned</m:t>
-              </m:r>
-              <m:r>
-                <w:rPr>
-                  <w:rFonts w:ascii="Cambria Math" w:hAnsi="Cambria Math"/>
+                  <w:rFonts w:ascii="Cambria Math" w:eastAsiaTheme="majorEastAsia" w:hAnsi="Cambria Math"/>
                 </w:rPr>
                 <m:t>,i</m:t>
               </m:r>
@@ -11186,633 +11851,14 @@
           </m:sSub>
           <m:r>
             <w:rPr>
-              <w:rFonts w:ascii="Cambria Math" w:hAnsi="Cambria Math"/>
+              <w:rFonts w:ascii="Cambria Math" w:eastAsiaTheme="majorEastAsia" w:hAnsi="Cambria Math"/>
             </w:rPr>
-            <m:t>=0.48</m:t>
+            <m:t>≤0.05</m:t>
           </m:r>
-        </m:oMath>
-      </m:oMathPara>
-    </w:p>
-    <w:p>
-      <w:pPr>
-        <w:jc w:val="center"/>
-      </w:pPr>
-      <w:r>
-        <w:br/>
-      </w:r>
-      <m:oMathPara>
-        <m:oMath>
           <m:r>
             <w:rPr>
-              <w:rFonts w:ascii="Cambria Math" w:hAnsi="Cambria Math"/>
+              <w:rFonts w:eastAsiaTheme="majorEastAsia"/>
             </w:rPr>
-            <m:t>mA</m:t>
-          </m:r>
-          <m:sSub>
-            <m:sSubPr>
-              <m:ctrlPr>
-                <w:rPr>
-                  <w:rFonts w:ascii="Cambria Math" w:hAnsi="Cambria Math"/>
-                </w:rPr>
-              </m:ctrlPr>
-            </m:sSubPr>
-            <m:e>
-              <m:r>
-                <w:rPr>
-                  <w:rFonts w:ascii="Cambria Math" w:hAnsi="Cambria Math"/>
-                </w:rPr>
-                <m:t>P</m:t>
-              </m:r>
-            </m:e>
-            <m:sub>
-              <m:r>
-                <m:rPr>
-                  <m:sty m:val="p"/>
-                </m:rPr>
-                <w:rPr>
-                  <w:rFonts w:ascii="Cambria Math" w:hAnsi="Cambria Math"/>
-                </w:rPr>
-                <m:t>SNOW,baseline</m:t>
-              </m:r>
-            </m:sub>
-          </m:sSub>
-          <m:r>
-            <m:rPr>
-              <m:sty m:val="p"/>
-            </m:rPr>
-            <w:rPr>
-              <w:rFonts w:ascii="Cambria Math" w:hAnsi="Cambria Math"/>
-            </w:rPr>
-            <m:t>=0.30</m:t>
-          </m:r>
-        </m:oMath>
-      </m:oMathPara>
-    </w:p>
-    <w:p>
-      <w:pPr>
-        <w:jc w:val="center"/>
-      </w:pPr>
-      <m:oMathPara>
-        <m:oMath>
-          <m:r>
-            <w:rPr>
-              <w:rFonts w:ascii="Cambria Math" w:hAnsi="Cambria Math"/>
-            </w:rPr>
-            <m:t>mA</m:t>
-          </m:r>
-          <m:sSub>
-            <m:sSubPr>
-              <m:ctrlPr>
-                <w:rPr>
-                  <w:rFonts w:ascii="Cambria Math" w:hAnsi="Cambria Math"/>
-                </w:rPr>
-              </m:ctrlPr>
-            </m:sSubPr>
-            <m:e>
-              <m:r>
-                <w:rPr>
-                  <w:rFonts w:ascii="Cambria Math" w:hAnsi="Cambria Math"/>
-                </w:rPr>
-                <m:t>P</m:t>
-              </m:r>
-            </m:e>
-            <m:sub>
-              <m:r>
-                <m:rPr>
-                  <m:sty m:val="p"/>
-                </m:rPr>
-                <w:rPr>
-                  <w:rFonts w:ascii="Cambria Math" w:hAnsi="Cambria Math"/>
-                </w:rPr>
-                <m:t>SNOW,pruned,</m:t>
-              </m:r>
-              <m:r>
-                <w:rPr>
-                  <w:rFonts w:ascii="Cambria Math" w:hAnsi="Cambria Math"/>
-                </w:rPr>
-                <m:t>i</m:t>
-              </m:r>
-            </m:sub>
-          </m:sSub>
-          <m:r>
-            <m:rPr>
-              <m:sty m:val="p"/>
-            </m:rPr>
-            <w:rPr>
-              <w:rFonts w:ascii="Cambria Math" w:hAnsi="Cambria Math"/>
-            </w:rPr>
-            <m:t>=0.294</m:t>
-          </m:r>
-        </m:oMath>
-      </m:oMathPara>
-    </w:p>
-    <w:p>
-      <w:pPr>
-        <w:jc w:val="center"/>
-      </w:pPr>
-    </w:p>
-    <w:p>
-      <w:pPr>
-        <w:jc w:val="center"/>
-      </w:pPr>
-      <w:r>
-        <w:t>L</w:t>
-      </w:r>
-      <w:r>
-        <w:t>ayer</w:t>
-      </w:r>
-      <w:r>
-        <w:t xml:space="preserve"> i</w:t>
-      </w:r>
-      <w:r>
-        <w:t xml:space="preserve"> contains </w:t>
-      </w:r>
-      <w:r>
-        <w:t xml:space="preserve">20,000 </w:t>
-      </w:r>
-      <w:r>
-        <w:t>parameters</w:t>
-      </w:r>
-    </w:p>
-    <w:p>
-      <w:pPr>
-        <w:jc w:val="center"/>
-      </w:pPr>
-      <w:r>
-        <w:t>T</w:t>
-      </w:r>
-      <w:r>
-        <w:t>he model contains</w:t>
-      </w:r>
-      <w:r>
-        <w:t xml:space="preserve"> 2,000,000 </w:t>
-      </w:r>
-      <w:r>
-        <w:t>parameters</w:t>
-      </w:r>
-    </w:p>
-    <w:p/>
-    <w:p>
-      <w:r>
-        <w:t>Calculations</w:t>
-      </w:r>
-      <w:r>
-        <w:t>:</w:t>
-      </w:r>
-    </w:p>
-    <w:p>
-      <m:oMathPara>
-        <m:oMath>
-          <m:r>
-            <w:rPr>
-              <w:rFonts w:ascii="Cambria Math" w:hAnsi="Cambria Math"/>
-            </w:rPr>
-            <m:t>A</m:t>
-          </m:r>
-          <m:sSub>
-            <m:sSubPr>
-              <m:ctrlPr>
-                <w:rPr>
-                  <w:rFonts w:ascii="Cambria Math" w:hAnsi="Cambria Math"/>
-                </w:rPr>
-              </m:ctrlPr>
-            </m:sSubPr>
-            <m:e>
-              <m:r>
-                <w:rPr>
-                  <w:rFonts w:ascii="Cambria Math" w:hAnsi="Cambria Math"/>
-                </w:rPr>
-                <m:t>D</m:t>
-              </m:r>
-            </m:e>
-            <m:sub>
-              <m:r>
-                <w:rPr>
-                  <w:rFonts w:ascii="Cambria Math" w:hAnsi="Cambria Math"/>
-                </w:rPr>
-                <m:t>1,i</m:t>
-              </m:r>
-            </m:sub>
-          </m:sSub>
-          <m:r>
-            <w:rPr>
-              <w:rFonts w:ascii="Cambria Math" w:hAnsi="Cambria Math"/>
-            </w:rPr>
-            <m:t>=0.50-0.48=0.02</m:t>
-          </m:r>
-        </m:oMath>
-      </m:oMathPara>
-    </w:p>
-    <w:p>
-      <m:oMathPara>
-        <m:oMath>
-          <m:r>
-            <w:rPr>
-              <w:rFonts w:ascii="Cambria Math" w:hAnsi="Cambria Math"/>
-            </w:rPr>
-            <m:t>NA</m:t>
-          </m:r>
-          <m:sSub>
-            <m:sSubPr>
-              <m:ctrlPr>
-                <w:rPr>
-                  <w:rFonts w:ascii="Cambria Math" w:hAnsi="Cambria Math"/>
-                </w:rPr>
-              </m:ctrlPr>
-            </m:sSubPr>
-            <m:e>
-              <m:r>
-                <w:rPr>
-                  <w:rFonts w:ascii="Cambria Math" w:hAnsi="Cambria Math"/>
-                </w:rPr>
-                <m:t>D</m:t>
-              </m:r>
-            </m:e>
-            <m:sub>
-              <m:r>
-                <w:rPr>
-                  <w:rFonts w:ascii="Cambria Math" w:hAnsi="Cambria Math"/>
-                </w:rPr>
-                <m:t>1,i</m:t>
-              </m:r>
-            </m:sub>
-          </m:sSub>
-          <m:r>
-            <w:rPr>
-              <w:rFonts w:ascii="Cambria Math" w:hAnsi="Cambria Math"/>
-            </w:rPr>
-            <m:t>=</m:t>
-          </m:r>
-          <m:f>
-            <m:fPr>
-              <m:ctrlPr>
-                <w:rPr>
-                  <w:rFonts w:ascii="Cambria Math" w:hAnsi="Cambria Math"/>
-                </w:rPr>
-              </m:ctrlPr>
-            </m:fPr>
-            <m:num>
-              <m:r>
-                <w:rPr>
-                  <w:rFonts w:ascii="Cambria Math" w:hAnsi="Cambria Math"/>
-                </w:rPr>
-                <m:t>0.02</m:t>
-              </m:r>
-            </m:num>
-            <m:den>
-              <m:r>
-                <w:rPr>
-                  <w:rFonts w:ascii="Cambria Math" w:hAnsi="Cambria Math"/>
-                </w:rPr>
-                <m:t>0.50</m:t>
-              </m:r>
-            </m:den>
-          </m:f>
-          <m:r>
-            <w:rPr>
-              <w:rFonts w:ascii="Cambria Math" w:hAnsi="Cambria Math"/>
-            </w:rPr>
-            <m:t>=0.04</m:t>
-          </m:r>
-        </m:oMath>
-      </m:oMathPara>
-    </w:p>
-    <w:p>
-      <w:pPr>
-        <w:jc w:val="center"/>
-      </w:pPr>
-    </w:p>
-    <w:p>
-      <m:oMathPara>
-        <m:oMath>
-          <m:r>
-            <w:rPr>
-              <w:rFonts w:ascii="Cambria Math" w:hAnsi="Cambria Math"/>
-            </w:rPr>
-            <m:t>A</m:t>
-          </m:r>
-          <m:sSub>
-            <m:sSubPr>
-              <m:ctrlPr>
-                <w:rPr>
-                  <w:rFonts w:ascii="Cambria Math" w:hAnsi="Cambria Math"/>
-                </w:rPr>
-              </m:ctrlPr>
-            </m:sSubPr>
-            <m:e>
-              <m:r>
-                <w:rPr>
-                  <w:rFonts w:ascii="Cambria Math" w:hAnsi="Cambria Math"/>
-                </w:rPr>
-                <m:t>D</m:t>
-              </m:r>
-            </m:e>
-            <m:sub>
-              <m:r>
-                <w:rPr>
-                  <w:rFonts w:ascii="Cambria Math" w:hAnsi="Cambria Math"/>
-                </w:rPr>
-                <m:t>2,i</m:t>
-              </m:r>
-            </m:sub>
-          </m:sSub>
-          <m:r>
-            <w:rPr>
-              <w:rFonts w:ascii="Cambria Math" w:hAnsi="Cambria Math"/>
-            </w:rPr>
-            <m:t>=0.30-0.294=0.006</m:t>
-          </m:r>
-        </m:oMath>
-      </m:oMathPara>
-    </w:p>
-    <w:p>
-      <m:oMathPara>
-        <m:oMath>
-          <m:r>
-            <w:rPr>
-              <w:rFonts w:ascii="Cambria Math" w:hAnsi="Cambria Math"/>
-            </w:rPr>
-            <m:t>NA</m:t>
-          </m:r>
-          <m:sSub>
-            <m:sSubPr>
-              <m:ctrlPr>
-                <w:rPr>
-                  <w:rFonts w:ascii="Cambria Math" w:hAnsi="Cambria Math"/>
-                </w:rPr>
-              </m:ctrlPr>
-            </m:sSubPr>
-            <m:e>
-              <m:r>
-                <w:rPr>
-                  <w:rFonts w:ascii="Cambria Math" w:hAnsi="Cambria Math"/>
-                </w:rPr>
-                <m:t>D</m:t>
-              </m:r>
-            </m:e>
-            <m:sub>
-              <m:r>
-                <w:rPr>
-                  <w:rFonts w:ascii="Cambria Math" w:hAnsi="Cambria Math"/>
-                </w:rPr>
-                <m:t>2,i</m:t>
-              </m:r>
-            </m:sub>
-          </m:sSub>
-          <m:r>
-            <w:rPr>
-              <w:rFonts w:ascii="Cambria Math" w:hAnsi="Cambria Math"/>
-            </w:rPr>
-            <m:t>=</m:t>
-          </m:r>
-          <m:f>
-            <m:fPr>
-              <m:ctrlPr>
-                <w:rPr>
-                  <w:rFonts w:ascii="Cambria Math" w:hAnsi="Cambria Math"/>
-                </w:rPr>
-              </m:ctrlPr>
-            </m:fPr>
-            <m:num>
-              <m:r>
-                <w:rPr>
-                  <w:rFonts w:ascii="Cambria Math" w:hAnsi="Cambria Math"/>
-                </w:rPr>
-                <m:t>0.006</m:t>
-              </m:r>
-            </m:num>
-            <m:den>
-              <m:r>
-                <w:rPr>
-                  <w:rFonts w:ascii="Cambria Math" w:hAnsi="Cambria Math"/>
-                </w:rPr>
-                <m:t>0.30</m:t>
-              </m:r>
-            </m:den>
-          </m:f>
-          <m:r>
-            <w:rPr>
-              <w:rFonts w:ascii="Cambria Math" w:hAnsi="Cambria Math"/>
-            </w:rPr>
-            <m:t>=0.02</m:t>
-          </m:r>
-        </m:oMath>
-      </m:oMathPara>
-    </w:p>
-    <w:p>
-      <w:pPr>
-        <w:jc w:val="center"/>
-      </w:pPr>
-    </w:p>
-    <w:p>
-      <m:oMathPara>
-        <m:oMath>
-          <m:sSub>
-            <m:sSubPr>
-              <m:ctrlPr>
-                <w:rPr>
-                  <w:rFonts w:ascii="Cambria Math" w:hAnsi="Cambria Math"/>
-                </w:rPr>
-              </m:ctrlPr>
-            </m:sSubPr>
-            <m:e>
-              <m:r>
-                <w:rPr>
-                  <w:rFonts w:ascii="Cambria Math" w:hAnsi="Cambria Math"/>
-                </w:rPr>
-                <m:t>S</m:t>
-              </m:r>
-            </m:e>
-            <m:sub>
-              <m:r>
-                <w:rPr>
-                  <w:rFonts w:ascii="Cambria Math" w:hAnsi="Cambria Math"/>
-                </w:rPr>
-                <m:t>i</m:t>
-              </m:r>
-            </m:sub>
-          </m:sSub>
-          <m:r>
-            <w:rPr>
-              <w:rFonts w:ascii="Cambria Math" w:hAnsi="Cambria Math"/>
-            </w:rPr>
-            <m:t>=0.04-0.02=0.02</m:t>
-          </m:r>
-        </m:oMath>
-      </m:oMathPara>
-    </w:p>
-    <w:p>
-      <w:pPr>
-        <w:jc w:val="center"/>
-      </w:pPr>
-    </w:p>
-    <w:p>
-      <w:pPr>
-        <w:jc w:val="center"/>
-      </w:pPr>
-    </w:p>
-    <w:p>
-      <m:oMathPara>
-        <m:oMath>
-          <m:sSub>
-            <m:sSubPr>
-              <m:ctrlPr>
-                <w:rPr>
-                  <w:rFonts w:ascii="Cambria Math" w:hAnsi="Cambria Math"/>
-                </w:rPr>
-              </m:ctrlPr>
-            </m:sSubPr>
-            <m:e>
-              <m:r>
-                <m:rPr>
-                  <m:sty m:val="p"/>
-                </m:rPr>
-                <w:rPr>
-                  <w:rFonts w:ascii="Cambria Math" w:hAnsi="Cambria Math"/>
-                </w:rPr>
-                <m:t>Parameters</m:t>
-              </m:r>
-            </m:e>
-            <m:sub>
-              <m:r>
-                <m:rPr>
-                  <m:sty m:val="p"/>
-                </m:rPr>
-                <w:rPr>
-                  <w:rFonts w:ascii="Cambria Math" w:hAnsi="Cambria Math"/>
-                </w:rPr>
-                <m:t>%</m:t>
-              </m:r>
-              <m:r>
-                <w:rPr>
-                  <w:rFonts w:ascii="Cambria Math" w:hAnsi="Cambria Math"/>
-                </w:rPr>
-                <m:t>,i</m:t>
-              </m:r>
-            </m:sub>
-          </m:sSub>
-          <m:r>
-            <w:rPr>
-              <w:rFonts w:ascii="Cambria Math" w:hAnsi="Cambria Math"/>
-            </w:rPr>
-            <m:t>=</m:t>
-          </m:r>
-          <m:f>
-            <m:fPr>
-              <m:ctrlPr>
-                <w:rPr>
-                  <w:rFonts w:ascii="Cambria Math" w:hAnsi="Cambria Math"/>
-                </w:rPr>
-              </m:ctrlPr>
-            </m:fPr>
-            <m:num>
-              <m:r>
-                <m:rPr>
-                  <m:sty m:val="p"/>
-                </m:rPr>
-                <w:rPr>
-                  <w:rFonts w:ascii="Cambria Math" w:hAnsi="Cambria Math"/>
-                </w:rPr>
-                <m:t>20,000</m:t>
-              </m:r>
-            </m:num>
-            <m:den>
-              <m:r>
-                <m:rPr>
-                  <m:sty m:val="p"/>
-                </m:rPr>
-                <w:rPr>
-                  <w:rFonts w:ascii="Cambria Math" w:hAnsi="Cambria Math"/>
-                </w:rPr>
-                <m:t>2,000,000</m:t>
-              </m:r>
-            </m:den>
-          </m:f>
-          <m:r>
-            <w:rPr>
-              <w:rFonts w:ascii="Cambria Math" w:hAnsi="Cambria Math"/>
-            </w:rPr>
-            <m:t>×100=1</m:t>
-          </m:r>
-        </m:oMath>
-      </m:oMathPara>
-    </w:p>
-    <w:p>
-      <w:pPr>
-        <w:jc w:val="center"/>
-      </w:pPr>
-    </w:p>
-    <w:p>
-      <w:pPr>
-        <w:jc w:val="center"/>
-      </w:pPr>
-    </w:p>
-    <w:p>
-      <m:oMathPara>
-        <m:oMath>
-          <m:sSub>
-            <m:sSubPr>
-              <m:ctrlPr>
-                <w:rPr>
-                  <w:rFonts w:ascii="Cambria Math" w:hAnsi="Cambria Math"/>
-                </w:rPr>
-              </m:ctrlPr>
-            </m:sSubPr>
-            <m:e>
-              <m:r>
-                <w:rPr>
-                  <w:rFonts w:ascii="Cambria Math" w:hAnsi="Cambria Math"/>
-                </w:rPr>
-                <m:t>P</m:t>
-              </m:r>
-            </m:e>
-            <m:sub>
-              <m:r>
-                <w:rPr>
-                  <w:rFonts w:ascii="Cambria Math" w:hAnsi="Cambria Math"/>
-                </w:rPr>
-                <m:t>i</m:t>
-              </m:r>
-            </m:sub>
-          </m:sSub>
-          <m:r>
-            <w:rPr>
-              <w:rFonts w:ascii="Cambria Math" w:hAnsi="Cambria Math"/>
-            </w:rPr>
-            <m:t>=</m:t>
-          </m:r>
-          <m:f>
-            <m:fPr>
-              <m:ctrlPr>
-                <w:rPr>
-                  <w:rFonts w:ascii="Cambria Math" w:hAnsi="Cambria Math"/>
-                </w:rPr>
-              </m:ctrlPr>
-            </m:fPr>
-            <m:num>
-              <m:r>
-                <w:rPr>
-                  <w:rFonts w:ascii="Cambria Math" w:hAnsi="Cambria Math"/>
-                </w:rPr>
-                <m:t>1</m:t>
-              </m:r>
-            </m:num>
-            <m:den>
-              <m:r>
-                <w:rPr>
-                  <w:rFonts w:ascii="Cambria Math" w:hAnsi="Cambria Math"/>
-                </w:rPr>
-                <m:t>0.02</m:t>
-              </m:r>
-            </m:den>
-          </m:f>
-          <m:r>
-            <w:rPr>
-              <w:rFonts w:ascii="Cambria Math" w:hAnsi="Cambria Math"/>
-            </w:rPr>
-            <m:t>=50</m:t>
-          </m:r>
-          <m:r>
             <w:br/>
           </m:r>
         </m:oMath>
@@ -11824,22 +11870,9 @@
           <w:rFonts w:eastAsiaTheme="majorEastAsia" w:cs="Times New Roman"/>
         </w:rPr>
       </w:pPr>
-      <w:r>
-        <w:rPr>
-          <w:rFonts w:eastAsiaTheme="majorEastAsia" w:cs="Times New Roman"/>
-        </w:rPr>
-        <w:br w:type="page"/>
-      </w:r>
-    </w:p>
-    <w:p>
-      <w:pPr>
-        <w:rPr>
-          <w:rFonts w:eastAsiaTheme="majorEastAsia" w:cs="Times New Roman"/>
-          <w:b/>
-          <w:bCs/>
-        </w:rPr>
-      </w:pPr>
-      <w:r>
+    </w:p>
+    <w:p>
+      <w:pPr>
         <w:rPr>
           <w:rFonts w:eastAsiaTheme="majorEastAsia" w:cs="Times New Roman"/>
           <w:b/>
@@ -11847,9 +11880,7 @@
           <w:sz w:val="32"/>
           <w:szCs w:val="28"/>
         </w:rPr>
-        <w:lastRenderedPageBreak/>
-        <w:t>3</w:t>
-      </w:r>
+      </w:pPr>
       <w:r>
         <w:rPr>
           <w:rFonts w:eastAsiaTheme="majorEastAsia" w:cs="Times New Roman"/>
@@ -11858,7 +11889,7 @@
           <w:sz w:val="32"/>
           <w:szCs w:val="28"/>
         </w:rPr>
-        <w:t>.</w:t>
+        <w:t>3</w:t>
       </w:r>
       <w:r>
         <w:rPr>
@@ -11868,7 +11899,7 @@
           <w:sz w:val="32"/>
           <w:szCs w:val="28"/>
         </w:rPr>
-        <w:t>3</w:t>
+        <w:t>.</w:t>
       </w:r>
       <w:r>
         <w:rPr>
@@ -11878,37 +11909,8 @@
           <w:sz w:val="32"/>
           <w:szCs w:val="28"/>
         </w:rPr>
-        <w:t xml:space="preserve"> Setup</w:t>
-      </w:r>
-    </w:p>
-    <w:p>
-      <w:pPr>
-        <w:rPr>
-          <w:rFonts w:eastAsiaTheme="majorEastAsia" w:cs="Times New Roman"/>
-        </w:rPr>
-      </w:pPr>
-      <w:r>
-        <w:rPr>
-          <w:rFonts w:eastAsiaTheme="majorEastAsia" w:cs="Times New Roman"/>
-        </w:rPr>
-        <w:t>(pending)</w:t>
-      </w:r>
-    </w:p>
-    <w:p>
-      <w:pPr>
-        <w:rPr>
-          <w:rFonts w:eastAsiaTheme="majorEastAsia" w:cs="Times New Roman"/>
-        </w:rPr>
-      </w:pPr>
-    </w:p>
-    <w:p>
-      <w:pPr>
-        <w:rPr>
-          <w:rFonts w:eastAsiaTheme="majorEastAsia" w:cs="Times New Roman"/>
-          <w:b/>
-          <w:bCs/>
-        </w:rPr>
-      </w:pPr>
+        <w:t>3</w:t>
+      </w:r>
       <w:r>
         <w:rPr>
           <w:rFonts w:eastAsiaTheme="majorEastAsia" w:cs="Times New Roman"/>
@@ -11917,7 +11919,7 @@
           <w:sz w:val="32"/>
           <w:szCs w:val="28"/>
         </w:rPr>
-        <w:t>3</w:t>
+        <w:t xml:space="preserve"> </w:t>
       </w:r>
       <w:r>
         <w:rPr>
@@ -11927,107 +11929,6 @@
           <w:sz w:val="32"/>
           <w:szCs w:val="28"/>
         </w:rPr>
-        <w:t>.</w:t>
-      </w:r>
-      <w:r>
-        <w:rPr>
-          <w:rFonts w:eastAsiaTheme="majorEastAsia" w:cs="Times New Roman"/>
-          <w:b/>
-          <w:bCs/>
-          <w:sz w:val="32"/>
-          <w:szCs w:val="28"/>
-        </w:rPr>
-        <w:t>4</w:t>
-      </w:r>
-      <w:r>
-        <w:rPr>
-          <w:rFonts w:eastAsiaTheme="majorEastAsia" w:cs="Times New Roman"/>
-          <w:b/>
-          <w:bCs/>
-          <w:sz w:val="32"/>
-          <w:szCs w:val="28"/>
-        </w:rPr>
-        <w:t xml:space="preserve"> Results</w:t>
-      </w:r>
-    </w:p>
-    <w:p>
-      <w:pPr>
-        <w:rPr>
-          <w:rFonts w:eastAsiaTheme="majorEastAsia" w:cs="Times New Roman"/>
-        </w:rPr>
-      </w:pPr>
-      <w:r>
-        <w:rPr>
-          <w:rFonts w:eastAsiaTheme="majorEastAsia" w:cs="Times New Roman"/>
-        </w:rPr>
-        <w:t>(pending)</w:t>
-      </w:r>
-    </w:p>
-    <w:p>
-      <w:pPr>
-        <w:rPr>
-          <w:rFonts w:eastAsiaTheme="majorEastAsia" w:cs="Times New Roman"/>
-        </w:rPr>
-      </w:pPr>
-    </w:p>
-    <w:p>
-      <w:pPr>
-        <w:rPr>
-          <w:rFonts w:eastAsiaTheme="majorEastAsia" w:cs="Times New Roman"/>
-          <w:b/>
-          <w:bCs/>
-          <w:sz w:val="32"/>
-          <w:szCs w:val="28"/>
-        </w:rPr>
-      </w:pPr>
-      <w:r>
-        <w:rPr>
-          <w:rFonts w:eastAsiaTheme="majorEastAsia" w:cs="Times New Roman"/>
-          <w:b/>
-          <w:bCs/>
-          <w:sz w:val="32"/>
-          <w:szCs w:val="28"/>
-        </w:rPr>
-        <w:t>3</w:t>
-      </w:r>
-      <w:r>
-        <w:rPr>
-          <w:rFonts w:eastAsiaTheme="majorEastAsia" w:cs="Times New Roman"/>
-          <w:b/>
-          <w:bCs/>
-          <w:sz w:val="32"/>
-          <w:szCs w:val="28"/>
-        </w:rPr>
-        <w:t>.</w:t>
-      </w:r>
-      <w:r>
-        <w:rPr>
-          <w:rFonts w:eastAsiaTheme="majorEastAsia" w:cs="Times New Roman"/>
-          <w:b/>
-          <w:bCs/>
-          <w:sz w:val="32"/>
-          <w:szCs w:val="28"/>
-        </w:rPr>
-        <w:t>5</w:t>
-      </w:r>
-      <w:r>
-        <w:rPr>
-          <w:rFonts w:eastAsiaTheme="majorEastAsia" w:cs="Times New Roman"/>
-          <w:b/>
-          <w:bCs/>
-          <w:sz w:val="32"/>
-          <w:szCs w:val="28"/>
-        </w:rPr>
-        <w:t xml:space="preserve"> </w:t>
-      </w:r>
-      <w:r>
-        <w:rPr>
-          <w:rFonts w:eastAsiaTheme="majorEastAsia" w:cs="Times New Roman"/>
-          <w:b/>
-          <w:bCs/>
-          <w:sz w:val="32"/>
-          <w:szCs w:val="28"/>
-        </w:rPr>
         <w:t>YOLO26n Pruning for Resource-Limited Devices</w:t>
       </w:r>
     </w:p>
@@ -12103,7 +12004,21 @@
         <w:rPr>
           <w:rFonts w:eastAsiaTheme="majorEastAsia" w:cs="Times New Roman"/>
         </w:rPr>
-        <w:t>Previous studies support this approach. NetAdapt adjusts a neural network according to the measured performance of the target device.</w:t>
+        <w:t xml:space="preserve">Previous studies support this approach. </w:t>
+      </w:r>
+      <w:proofErr w:type="spellStart"/>
+      <w:r>
+        <w:rPr>
+          <w:rFonts w:eastAsiaTheme="majorEastAsia" w:cs="Times New Roman"/>
+        </w:rPr>
+        <w:t>NetAdapt</w:t>
+      </w:r>
+      <w:proofErr w:type="spellEnd"/>
+      <w:r>
+        <w:rPr>
+          <w:rFonts w:eastAsiaTheme="majorEastAsia" w:cs="Times New Roman"/>
+        </w:rPr>
+        <w:t xml:space="preserve"> adjusts a neural network according to the measured performance of the target device.</w:t>
       </w:r>
       <w:r>
         <w:rPr>
@@ -12125,11 +12040,19 @@
           <w:rFonts w:eastAsiaTheme="majorEastAsia" w:cs="Times New Roman"/>
         </w:rPr>
       </w:pPr>
-      <w:r>
-        <w:rPr>
-          <w:rFonts w:eastAsiaTheme="majorEastAsia" w:cs="Times New Roman"/>
-        </w:rPr>
-        <w:t xml:space="preserve">DepGraph shows that connected layers and channels </w:t>
+      <w:proofErr w:type="spellStart"/>
+      <w:r>
+        <w:rPr>
+          <w:rFonts w:eastAsiaTheme="majorEastAsia" w:cs="Times New Roman"/>
+        </w:rPr>
+        <w:t>DepGraph</w:t>
+      </w:r>
+      <w:proofErr w:type="spellEnd"/>
+      <w:r>
+        <w:rPr>
+          <w:rFonts w:eastAsiaTheme="majorEastAsia" w:cs="Times New Roman"/>
+        </w:rPr>
+        <w:t xml:space="preserve"> shows that connected layers and channels </w:t>
       </w:r>
       <w:r>
         <w:rPr>
@@ -12563,8 +12486,23 @@
         <w:rPr>
           <w:rFonts w:eastAsiaTheme="majorEastAsia"/>
         </w:rPr>
-        <w:t xml:space="preserve">In Mobaxterm, select section, serial, and insert COM4, with 115200 speed, 8 data bits, 1 stop bit, </w:t>
-      </w:r>
+        <w:t xml:space="preserve">In </w:t>
+      </w:r>
+      <w:proofErr w:type="spellStart"/>
+      <w:r>
+        <w:rPr>
+          <w:rFonts w:eastAsiaTheme="majorEastAsia"/>
+        </w:rPr>
+        <w:t>Mobaxterm</w:t>
+      </w:r>
+      <w:proofErr w:type="spellEnd"/>
+      <w:r>
+        <w:rPr>
+          <w:rFonts w:eastAsiaTheme="majorEastAsia"/>
+        </w:rPr>
+        <w:t xml:space="preserve">, select section, serial, and insert COM4, with 115200 speed, 8 data bits, 1 stop bit, </w:t>
+      </w:r>
+      <w:proofErr w:type="gramStart"/>
       <w:r>
         <w:rPr>
           <w:rFonts w:eastAsiaTheme="majorEastAsia"/>
@@ -12575,7 +12513,14 @@
         <w:rPr>
           <w:rFonts w:eastAsiaTheme="majorEastAsia"/>
         </w:rPr>
-        <w:t xml:space="preserve">one parity, </w:t>
+        <w:t>one</w:t>
+      </w:r>
+      <w:proofErr w:type="gramEnd"/>
+      <w:r>
+        <w:rPr>
+          <w:rFonts w:eastAsiaTheme="majorEastAsia"/>
+        </w:rPr>
+        <w:t xml:space="preserve"> parity, </w:t>
       </w:r>
       <w:r>
         <w:rPr>
@@ -12721,7 +12666,35 @@
         <w:rPr>
           <w:rFonts w:eastAsiaTheme="majorEastAsia"/>
         </w:rPr>
-        <w:t>In Mobaxterm select section, ssh, and use xilinx as username, with port 22</w:t>
+        <w:t xml:space="preserve">In </w:t>
+      </w:r>
+      <w:proofErr w:type="spellStart"/>
+      <w:r>
+        <w:rPr>
+          <w:rFonts w:eastAsiaTheme="majorEastAsia"/>
+        </w:rPr>
+        <w:t>Mobaxterm</w:t>
+      </w:r>
+      <w:proofErr w:type="spellEnd"/>
+      <w:r>
+        <w:rPr>
+          <w:rFonts w:eastAsiaTheme="majorEastAsia"/>
+        </w:rPr>
+        <w:t xml:space="preserve"> select section, ssh, and use </w:t>
+      </w:r>
+      <w:proofErr w:type="spellStart"/>
+      <w:r>
+        <w:rPr>
+          <w:rFonts w:eastAsiaTheme="majorEastAsia"/>
+        </w:rPr>
+        <w:t>xilinx</w:t>
+      </w:r>
+      <w:proofErr w:type="spellEnd"/>
+      <w:r>
+        <w:rPr>
+          <w:rFonts w:eastAsiaTheme="majorEastAsia"/>
+        </w:rPr>
+        <w:t xml:space="preserve"> as username, with port 22</w:t>
       </w:r>
     </w:p>
     <w:p>
@@ -12739,8 +12712,16 @@
         <w:rPr>
           <w:rFonts w:eastAsiaTheme="majorEastAsia"/>
         </w:rPr>
-        <w:t>After entering, the password is also xilinx</w:t>
-      </w:r>
+        <w:t xml:space="preserve">After entering, the password is also </w:t>
+      </w:r>
+      <w:proofErr w:type="spellStart"/>
+      <w:r>
+        <w:rPr>
+          <w:rFonts w:eastAsiaTheme="majorEastAsia"/>
+        </w:rPr>
+        <w:t>xilinx</w:t>
+      </w:r>
+      <w:proofErr w:type="spellEnd"/>
     </w:p>
     <w:p>
       <w:pPr>
@@ -12763,8 +12744,30 @@
         <w:rPr>
           <w:rFonts w:eastAsiaTheme="majorEastAsia"/>
         </w:rPr>
-        <w:t>one, it can be used in a local pc</w:t>
-      </w:r>
+        <w:t xml:space="preserve">one, it can be used </w:t>
+      </w:r>
+      <w:proofErr w:type="gramStart"/>
+      <w:r>
+        <w:rPr>
+          <w:rFonts w:eastAsiaTheme="majorEastAsia"/>
+        </w:rPr>
+        <w:t>in</w:t>
+      </w:r>
+      <w:proofErr w:type="gramEnd"/>
+      <w:r>
+        <w:rPr>
+          <w:rFonts w:eastAsiaTheme="majorEastAsia"/>
+        </w:rPr>
+        <w:t xml:space="preserve"> a local </w:t>
+      </w:r>
+      <w:proofErr w:type="gramStart"/>
+      <w:r>
+        <w:rPr>
+          <w:rFonts w:eastAsiaTheme="majorEastAsia"/>
+        </w:rPr>
+        <w:t>pc</w:t>
+      </w:r>
+      <w:proofErr w:type="gramEnd"/>
     </w:p>
     <w:p>
       <w:pPr>
@@ -13444,11 +13447,19 @@
                 <w:rFonts w:eastAsiaTheme="majorEastAsia"/>
               </w:rPr>
             </w:pPr>
-            <w:r>
-              <w:rPr>
-                <w:rFonts w:eastAsiaTheme="majorEastAsia"/>
-              </w:rPr>
-              <w:t>PynqLinux 2.5, based on Ubuntu 18.04</w:t>
+            <w:proofErr w:type="spellStart"/>
+            <w:r>
+              <w:rPr>
+                <w:rFonts w:eastAsiaTheme="majorEastAsia"/>
+              </w:rPr>
+              <w:t>PynqLinux</w:t>
+            </w:r>
+            <w:proofErr w:type="spellEnd"/>
+            <w:r>
+              <w:rPr>
+                <w:rFonts w:eastAsiaTheme="majorEastAsia"/>
+              </w:rPr>
+              <w:t xml:space="preserve"> 2.5, based on Ubuntu 18.04</w:t>
             </w:r>
           </w:p>
         </w:tc>
@@ -14138,7 +14149,15 @@
         <w:t>d</w:t>
       </w:r>
       <w:r>
-        <w:t xml:space="preserve"> overall, per-weather, and per-class results rather than relying only on one aggregate mAP value.</w:t>
+        <w:t xml:space="preserve"> overall, per-weather, and per-class results rather than relying only on one aggregate </w:t>
+      </w:r>
+      <w:proofErr w:type="spellStart"/>
+      <w:r>
+        <w:t>mAP</w:t>
+      </w:r>
+      <w:proofErr w:type="spellEnd"/>
+      <w:r>
+        <w:t xml:space="preserve"> value.</w:t>
       </w:r>
       <w:r>
         <w:t xml:space="preserve"> [1]</w:t>
@@ -14304,7 +14323,23 @@
         <w:ind w:left="480" w:hangingChars="200" w:hanging="480"/>
       </w:pPr>
       <w:r>
-        <w:t xml:space="preserve">[2] Jocher et al., Ultralytics YOLO26: Unified Real-Time End-to-End Vision Models, 2026. </w:t>
+        <w:t xml:space="preserve">[2] </w:t>
+      </w:r>
+      <w:proofErr w:type="spellStart"/>
+      <w:r>
+        <w:t>Jocher</w:t>
+      </w:r>
+      <w:proofErr w:type="spellEnd"/>
+      <w:r>
+        <w:t xml:space="preserve"> et al., </w:t>
+      </w:r>
+      <w:proofErr w:type="spellStart"/>
+      <w:r>
+        <w:t>Ultralytics</w:t>
+      </w:r>
+      <w:proofErr w:type="spellEnd"/>
+      <w:r>
+        <w:t xml:space="preserve"> YOLO26: Unified Real-Time End-to-End Vision Models, 2026. </w:t>
       </w:r>
       <w:hyperlink r:id="rId12" w:history="1">
         <w:r>
@@ -14346,7 +14381,15 @@
         <w:ind w:left="480" w:hangingChars="200" w:hanging="480"/>
       </w:pPr>
       <w:r>
-        <w:t xml:space="preserve">[4] Sakaridis et al., ACDC: The Adverse Conditions Dataset with Correspondences for Semantic Driving Scene Perception, 2021. </w:t>
+        <w:t xml:space="preserve">[4] </w:t>
+      </w:r>
+      <w:proofErr w:type="spellStart"/>
+      <w:r>
+        <w:t>Sakaridis</w:t>
+      </w:r>
+      <w:proofErr w:type="spellEnd"/>
+      <w:r>
+        <w:t xml:space="preserve"> et al., ACDC: The Adverse Conditions Dataset with Correspondences for Semantic Driving Scene Perception, 2021. </w:t>
       </w:r>
       <w:hyperlink r:id="rId14" w:history="1">
         <w:r>
@@ -14367,7 +14410,15 @@
         <w:ind w:left="480" w:hangingChars="200" w:hanging="480"/>
       </w:pPr>
       <w:r>
-        <w:t xml:space="preserve">[5] Yang et al., NetAdapt: Platform-Aware Neural Network Adaptation for Mobile Applications, 2018. </w:t>
+        <w:t xml:space="preserve">[5] Yang et al., </w:t>
+      </w:r>
+      <w:proofErr w:type="spellStart"/>
+      <w:r>
+        <w:t>NetAdapt</w:t>
+      </w:r>
+      <w:proofErr w:type="spellEnd"/>
+      <w:r>
+        <w:t xml:space="preserve">: Platform-Aware Neural Network Adaptation for Mobile Applications, 2018. </w:t>
       </w:r>
       <w:hyperlink r:id="rId15" w:history="1">
         <w:r>
@@ -14388,7 +14439,15 @@
         <w:ind w:left="480" w:hangingChars="200" w:hanging="480"/>
       </w:pPr>
       <w:r>
-        <w:t xml:space="preserve">[6] Fang et al., DepGraph: Towards Any Structural Pruning, 2023. </w:t>
+        <w:t xml:space="preserve">[6] Fang et al., </w:t>
+      </w:r>
+      <w:proofErr w:type="spellStart"/>
+      <w:r>
+        <w:t>DepGraph</w:t>
+      </w:r>
+      <w:proofErr w:type="spellEnd"/>
+      <w:r>
+        <w:t xml:space="preserve">: Towards Any Structural Pruning, 2023. </w:t>
       </w:r>
       <w:hyperlink r:id="rId16" w:history="1">
         <w:r>

</xml_diff>